<commit_message>
Apply questions 1 to 8 to the Word file and cover as SRS v1.7
Word file: cover (version 1.7, date, group members, revision history),
Section 1.5, three roles in 2.3 and 3.1.1, alert and acknowledge rules,
limit changes, security rules, sampling and storage rules, PR-001 to
PR-007 sizing and timing, FR-5 single abnormal level, DC-006 and Section 5
demonstration note, Appendix B Flask and React, Appendices C and D.
Numbers stay in page order with lettered additions. Text copy refreshed.
Changelog, README and statements doc updated to match.

Co-Authored-By: Claude Sonnet 5.5 <noreply@anthropic.com>
Claude-Session: https://claude.ai/code/session_01SRX1M5DGSRYirsGnFLCnPL
</commit_message>
<xml_diff>
--- a/srs/SRS_Industrial_Fault_Detection.docx
+++ b/srs/SRS_Industrial_Fault_Detection.docx
@@ -61,7 +61,7 @@
           <w:sz w:val="24"/>
           <w:szCs w:val="24"/>
         </w:rPr>
-        <w:t>Version 1.1</w:t>
+        <w:t xml:space="preserve">Version 1.7</w:t>
       </w:r>
     </w:p>
     <w:p>
@@ -89,9 +89,459 @@
           <w:sz w:val="22"/>
           <w:szCs w:val="22"/>
         </w:rPr>
-        <w:t>20-09-2026</w:t>
-      </w:r>
-    </w:p>
+        <w:t xml:space="preserve">Group members: Prince Msowoya, Zilpah Kalipa, Theresa Somanje, Opra Chikwangwala, Steven Nkhoma, Akuzike Mphande, Timothy Kaperenganya</w:t>
+      </w:r>
+    </w:p>
+    <w:p>
+      <w:pPr>
+        <w:spacing w:after="200"/>
+        <w:jc w:val="center"/>
+      </w:pPr>
+      <w:r>
+        <w:rPr>
+          <w:rFonts w:ascii="Calibri" w:eastAsia="Calibri" w:hAnsi="Calibri" w:cs="Calibri"/>
+          <w:sz w:val="22"/>
+          <w:szCs w:val="22"/>
+        </w:rPr>
+        <w:t xml:space="preserve">26-10-2026</w:t>
+      </w:r>
+    </w:p>
+    <w:p>
+      <w:pPr>
+        <w:spacing w:after="200"/>
+        <w:jc w:val="center"/>
+      </w:pPr>
+      <w:r>
+        <w:rPr>
+          <w:rFonts w:ascii="Calibri" w:eastAsia="Calibri" w:hAnsi="Calibri" w:cs="Calibri"/>
+          <w:sz w:val="22"/>
+          <w:szCs w:val="22"/>
+        </w:rPr>
+        <w:t xml:space="preserve">Revision History</w:t>
+      </w:r>
+    </w:p>
+    <w:tbl>
+      <w:tblPr>
+        <w:tblW w:w="8800" w:type="dxa"/>
+        <w:tblBorders>
+          <w:top w:val="single" w:sz="4" w:space="0" w:color="auto"/>
+          <w:left w:val="single" w:sz="4" w:space="0" w:color="auto"/>
+          <w:bottom w:val="single" w:sz="4" w:space="0" w:color="auto"/>
+          <w:right w:val="single" w:sz="4" w:space="0" w:color="auto"/>
+          <w:insideH w:val="single" w:sz="4" w:space="0" w:color="auto"/>
+          <w:insideV w:val="single" w:sz="4" w:space="0" w:color="auto"/>
+        </w:tblBorders>
+        <w:tblCellMar>
+          <w:left w:w="10" w:type="dxa"/>
+          <w:right w:w="10" w:type="dxa"/>
+        </w:tblCellMar>
+        <w:tblLook w:val="04A0" w:firstRow="1" w:lastRow="0" w:firstColumn="1" w:lastColumn="0" w:noHBand="0" w:noVBand="1"/>
+      </w:tblPr>
+      <w:tblGrid>
+        <w:gridCol w:w="900"/>
+        <w:gridCol w:w="6200"/>
+        <w:gridCol w:w="1700"/>
+      </w:tblGrid>
+      <w:tr>
+        <w:tblPrEx>
+          <w:tblCellMar>
+            <w:top w:w="0" w:type="dxa"/>
+            <w:bottom w:w="0" w:type="dxa"/>
+          </w:tblCellMar>
+        </w:tblPrEx>
+        <w:tc>
+          <w:tcPr>
+            <w:tcW w:w="900" w:type="dxa"/>
+            <w:shd w:val="clear" w:color="auto" w:fill="D9D9D9"/>
+            <w:tcMar>
+              <w:top w:w="80" w:type="dxa"/>
+              <w:left w:w="100" w:type="dxa"/>
+              <w:bottom w:w="80" w:type="dxa"/>
+              <w:right w:w="100" w:type="dxa"/>
+            </w:tcMar>
+          </w:tcPr>
+          <w:p>
+            <w:r>
+              <w:rPr>
+                <w:rFonts w:ascii="Calibri" w:eastAsia="Calibri" w:hAnsi="Calibri" w:cs="Calibri"/>
+                <w:b/>
+                <w:bCs/>
+              </w:rPr>
+              <w:t xml:space="preserve">Version</w:t>
+            </w:r>
+          </w:p>
+        </w:tc>
+        <w:tc>
+          <w:tcPr>
+            <w:tcW w:w="6200" w:type="dxa"/>
+            <w:shd w:val="clear" w:color="auto" w:fill="D9D9D9"/>
+            <w:tcMar>
+              <w:top w:w="80" w:type="dxa"/>
+              <w:left w:w="100" w:type="dxa"/>
+              <w:bottom w:w="80" w:type="dxa"/>
+              <w:right w:w="100" w:type="dxa"/>
+            </w:tcMar>
+          </w:tcPr>
+          <w:p>
+            <w:r>
+              <w:rPr>
+                <w:rFonts w:ascii="Calibri" w:eastAsia="Calibri" w:hAnsi="Calibri" w:cs="Calibri"/>
+                <w:b/>
+                <w:bCs/>
+              </w:rPr>
+              <w:t xml:space="preserve">Changes</w:t>
+            </w:r>
+          </w:p>
+        </w:tc>
+        <w:tc>
+          <w:tcPr>
+            <w:tcW w:w="1700" w:type="dxa"/>
+            <w:shd w:val="clear" w:color="auto" w:fill="D9D9D9"/>
+            <w:tcMar>
+              <w:top w:w="80" w:type="dxa"/>
+              <w:left w:w="100" w:type="dxa"/>
+              <w:bottom w:w="80" w:type="dxa"/>
+              <w:right w:w="100" w:type="dxa"/>
+            </w:tcMar>
+          </w:tcPr>
+          <w:p>
+            <w:r>
+              <w:rPr>
+                <w:rFonts w:ascii="Calibri" w:eastAsia="Calibri" w:hAnsi="Calibri" w:cs="Calibri"/>
+                <w:b/>
+                <w:bCs/>
+              </w:rPr>
+              <w:t xml:space="preserve">Date / tag</w:t>
+            </w:r>
+          </w:p>
+        </w:tc>
+      </w:tr>
+      <w:tr>
+        <w:tblPrEx>
+          <w:tblCellMar>
+            <w:top w:w="0" w:type="dxa"/>
+            <w:bottom w:w="0" w:type="dxa"/>
+          </w:tblCellMar>
+        </w:tblPrEx>
+        <w:tc>
+          <w:tcPr>
+            <w:tcW w:w="900" w:type="dxa"/>
+            <w:tcMar>
+              <w:top w:w="80" w:type="dxa"/>
+              <w:left w:w="100" w:type="dxa"/>
+              <w:bottom w:w="80" w:type="dxa"/>
+              <w:right w:w="100" w:type="dxa"/>
+            </w:tcMar>
+          </w:tcPr>
+          <w:p>
+            <w:r>
+              <w:rPr>
+                <w:rFonts w:ascii="Calibri" w:eastAsia="Calibri" w:hAnsi="Calibri" w:cs="Calibri"/>
+              </w:rPr>
+              <w:t xml:space="preserve">1.3</w:t>
+            </w:r>
+          </w:p>
+        </w:tc>
+        <w:tc>
+          <w:tcPr>
+            <w:tcW w:w="6200" w:type="dxa"/>
+            <w:tcMar>
+              <w:top w:w="80" w:type="dxa"/>
+              <w:left w:w="100" w:type="dxa"/>
+              <w:bottom w:w="80" w:type="dxa"/>
+              <w:right w:w="100" w:type="dxa"/>
+            </w:tcMar>
+          </w:tcPr>
+          <w:p>
+            <w:r>
+              <w:rPr>
+                <w:rFonts w:ascii="Calibri" w:eastAsia="Calibri" w:hAnsi="Calibri" w:cs="Calibri"/>
+              </w:rPr>
+              <w:t xml:space="preserve">The document as received, with margin notes. FR-1 to FR-13 and NFR-1 to NFR-14.</w:t>
+            </w:r>
+          </w:p>
+        </w:tc>
+        <w:tc>
+          <w:tcPr>
+            <w:tcW w:w="1700" w:type="dxa"/>
+            <w:tcMar>
+              <w:top w:w="80" w:type="dxa"/>
+              <w:left w:w="100" w:type="dxa"/>
+              <w:bottom w:w="80" w:type="dxa"/>
+              <w:right w:w="100" w:type="dxa"/>
+            </w:tcMar>
+          </w:tcPr>
+          <w:p>
+            <w:r>
+              <w:rPr>
+                <w:rFonts w:ascii="Calibri" w:eastAsia="Calibri" w:hAnsi="Calibri" w:cs="Calibri"/>
+              </w:rPr>
+              <w:t xml:space="preserve">Tag v1.3</w:t>
+            </w:r>
+          </w:p>
+        </w:tc>
+      </w:tr>
+      <w:tr>
+        <w:tblPrEx>
+          <w:tblCellMar>
+            <w:top w:w="0" w:type="dxa"/>
+            <w:bottom w:w="0" w:type="dxa"/>
+          </w:tblCellMar>
+        </w:tblPrEx>
+        <w:tc>
+          <w:tcPr>
+            <w:tcW w:w="900" w:type="dxa"/>
+            <w:tcMar>
+              <w:top w:w="80" w:type="dxa"/>
+              <w:left w:w="100" w:type="dxa"/>
+              <w:bottom w:w="80" w:type="dxa"/>
+              <w:right w:w="100" w:type="dxa"/>
+            </w:tcMar>
+          </w:tcPr>
+          <w:p>
+            <w:r>
+              <w:rPr>
+                <w:rFonts w:ascii="Calibri" w:eastAsia="Calibri" w:hAnsi="Calibri" w:cs="Calibri"/>
+              </w:rPr>
+              <w:t xml:space="preserve">1.4</w:t>
+            </w:r>
+          </w:p>
+        </w:tc>
+        <w:tc>
+          <w:tcPr>
+            <w:tcW w:w="6200" w:type="dxa"/>
+            <w:tcMar>
+              <w:top w:w="80" w:type="dxa"/>
+              <w:left w:w="100" w:type="dxa"/>
+              <w:bottom w:w="80" w:type="dxa"/>
+              <w:right w:w="100" w:type="dxa"/>
+            </w:tcMar>
+          </w:tcPr>
+          <w:p>
+            <w:r>
+              <w:rPr>
+                <w:rFonts w:ascii="Calibri" w:eastAsia="Calibri" w:hAnsi="Calibri" w:cs="Calibri"/>
+              </w:rPr>
+              <w:t xml:space="preserve">Added FR-14 to FR-27, DC-001 to DC-008 and PR-001 to PR-007. Margin notes resolved.</w:t>
+            </w:r>
+          </w:p>
+        </w:tc>
+        <w:tc>
+          <w:tcPr>
+            <w:tcW w:w="1700" w:type="dxa"/>
+            <w:tcMar>
+              <w:top w:w="80" w:type="dxa"/>
+              <w:left w:w="100" w:type="dxa"/>
+              <w:bottom w:w="80" w:type="dxa"/>
+              <w:right w:w="100" w:type="dxa"/>
+            </w:tcMar>
+          </w:tcPr>
+          <w:p>
+            <w:r>
+              <w:rPr>
+                <w:rFonts w:ascii="Calibri" w:eastAsia="Calibri" w:hAnsi="Calibri" w:cs="Calibri"/>
+              </w:rPr>
+              <w:t xml:space="preserve">Tag v1.4</w:t>
+            </w:r>
+          </w:p>
+        </w:tc>
+      </w:tr>
+      <w:tr>
+        <w:tblPrEx>
+          <w:tblCellMar>
+            <w:top w:w="0" w:type="dxa"/>
+            <w:bottom w:w="0" w:type="dxa"/>
+          </w:tblCellMar>
+        </w:tblPrEx>
+        <w:tc>
+          <w:tcPr>
+            <w:tcW w:w="900" w:type="dxa"/>
+            <w:tcMar>
+              <w:top w:w="80" w:type="dxa"/>
+              <w:left w:w="100" w:type="dxa"/>
+              <w:bottom w:w="80" w:type="dxa"/>
+              <w:right w:w="100" w:type="dxa"/>
+            </w:tcMar>
+          </w:tcPr>
+          <w:p>
+            <w:r>
+              <w:rPr>
+                <w:rFonts w:ascii="Calibri" w:eastAsia="Calibri" w:hAnsi="Calibri" w:cs="Calibri"/>
+              </w:rPr>
+              <w:t xml:space="preserve">1.5</w:t>
+            </w:r>
+          </w:p>
+        </w:tc>
+        <w:tc>
+          <w:tcPr>
+            <w:tcW w:w="6200" w:type="dxa"/>
+            <w:tcMar>
+              <w:top w:w="80" w:type="dxa"/>
+              <w:left w:w="100" w:type="dxa"/>
+              <w:bottom w:w="80" w:type="dxa"/>
+              <w:right w:w="100" w:type="dxa"/>
+            </w:tcMar>
+          </w:tcPr>
+          <w:p>
+            <w:r>
+              <w:rPr>
+                <w:rFonts w:ascii="Calibri" w:eastAsia="Calibri" w:hAnsi="Calibri" w:cs="Calibri"/>
+              </w:rPr>
+              <w:t xml:space="preserve">Non-functional requirements merged into Section 3.5. Sections 3.3 to 3.6 renamed.</w:t>
+            </w:r>
+          </w:p>
+        </w:tc>
+        <w:tc>
+          <w:tcPr>
+            <w:tcW w:w="1700" w:type="dxa"/>
+            <w:tcMar>
+              <w:top w:w="80" w:type="dxa"/>
+              <w:left w:w="100" w:type="dxa"/>
+              <w:bottom w:w="80" w:type="dxa"/>
+              <w:right w:w="100" w:type="dxa"/>
+            </w:tcMar>
+          </w:tcPr>
+          <w:p>
+            <w:r>
+              <w:rPr>
+                <w:rFonts w:ascii="Calibri" w:eastAsia="Calibri" w:hAnsi="Calibri" w:cs="Calibri"/>
+              </w:rPr>
+              <w:t xml:space="preserve">Tag v1.5</w:t>
+            </w:r>
+          </w:p>
+        </w:tc>
+      </w:tr>
+      <w:tr>
+        <w:tblPrEx>
+          <w:tblCellMar>
+            <w:top w:w="0" w:type="dxa"/>
+            <w:bottom w:w="0" w:type="dxa"/>
+          </w:tblCellMar>
+        </w:tblPrEx>
+        <w:tc>
+          <w:tcPr>
+            <w:tcW w:w="900" w:type="dxa"/>
+            <w:tcMar>
+              <w:top w:w="80" w:type="dxa"/>
+              <w:left w:w="100" w:type="dxa"/>
+              <w:bottom w:w="80" w:type="dxa"/>
+              <w:right w:w="100" w:type="dxa"/>
+            </w:tcMar>
+          </w:tcPr>
+          <w:p>
+            <w:r>
+              <w:rPr>
+                <w:rFonts w:ascii="Calibri" w:eastAsia="Calibri" w:hAnsi="Calibri" w:cs="Calibri"/>
+              </w:rPr>
+              <w:t xml:space="preserve">1.6</w:t>
+            </w:r>
+          </w:p>
+        </w:tc>
+        <w:tc>
+          <w:tcPr>
+            <w:tcW w:w="6200" w:type="dxa"/>
+            <w:tcMar>
+              <w:top w:w="80" w:type="dxa"/>
+              <w:left w:w="100" w:type="dxa"/>
+              <w:bottom w:w="80" w:type="dxa"/>
+              <w:right w:w="100" w:type="dxa"/>
+            </w:tcMar>
+          </w:tcPr>
+          <w:p>
+            <w:r>
+              <w:rPr>
+                <w:rFonts w:ascii="Calibri" w:eastAsia="Calibri" w:hAnsi="Calibri" w:cs="Calibri"/>
+              </w:rPr>
+              <w:t xml:space="preserve">Requirements renumbered in page order. New FR-6 (trend check). UC-2 rewritten.</w:t>
+            </w:r>
+          </w:p>
+        </w:tc>
+        <w:tc>
+          <w:tcPr>
+            <w:tcW w:w="1700" w:type="dxa"/>
+            <w:tcMar>
+              <w:top w:w="80" w:type="dxa"/>
+              <w:left w:w="100" w:type="dxa"/>
+              <w:bottom w:w="80" w:type="dxa"/>
+              <w:right w:w="100" w:type="dxa"/>
+            </w:tcMar>
+          </w:tcPr>
+          <w:p>
+            <w:r>
+              <w:rPr>
+                <w:rFonts w:ascii="Calibri" w:eastAsia="Calibri" w:hAnsi="Calibri" w:cs="Calibri"/>
+              </w:rPr>
+              <w:t xml:space="preserve">Tag v1.6</w:t>
+            </w:r>
+          </w:p>
+        </w:tc>
+      </w:tr>
+      <w:tr>
+        <w:tblPrEx>
+          <w:tblCellMar>
+            <w:top w:w="0" w:type="dxa"/>
+            <w:bottom w:w="0" w:type="dxa"/>
+          </w:tblCellMar>
+        </w:tblPrEx>
+        <w:tc>
+          <w:tcPr>
+            <w:tcW w:w="900" w:type="dxa"/>
+            <w:tcMar>
+              <w:top w:w="80" w:type="dxa"/>
+              <w:left w:w="100" w:type="dxa"/>
+              <w:bottom w:w="80" w:type="dxa"/>
+              <w:right w:w="100" w:type="dxa"/>
+            </w:tcMar>
+          </w:tcPr>
+          <w:p>
+            <w:r>
+              <w:rPr>
+                <w:rFonts w:ascii="Calibri" w:eastAsia="Calibri" w:hAnsi="Calibri" w:cs="Calibri"/>
+              </w:rPr>
+              <w:t xml:space="preserve">1.7</w:t>
+            </w:r>
+          </w:p>
+        </w:tc>
+        <w:tc>
+          <w:tcPr>
+            <w:tcW w:w="6200" w:type="dxa"/>
+            <w:tcMar>
+              <w:top w:w="80" w:type="dxa"/>
+              <w:left w:w="100" w:type="dxa"/>
+              <w:bottom w:w="80" w:type="dxa"/>
+              <w:right w:w="100" w:type="dxa"/>
+            </w:tcMar>
+          </w:tcPr>
+          <w:p>
+            <w:r>
+              <w:rPr>
+                <w:rFonts w:ascii="Calibri" w:eastAsia="Calibri" w:hAnsi="Calibri" w:cs="Calibri"/>
+              </w:rPr>
+              <w:t xml:space="preserve">Three roles. Alert and acknowledge rules. Limits can be changed. Security rules. One reading per second and storage rules. Status update every 10 seconds with a critical alert within 2 seconds. Flask and React. Group members added.</w:t>
+            </w:r>
+          </w:p>
+        </w:tc>
+        <w:tc>
+          <w:tcPr>
+            <w:tcW w:w="1700" w:type="dxa"/>
+            <w:tcMar>
+              <w:top w:w="80" w:type="dxa"/>
+              <w:left w:w="100" w:type="dxa"/>
+              <w:bottom w:w="80" w:type="dxa"/>
+              <w:right w:w="100" w:type="dxa"/>
+            </w:tcMar>
+          </w:tcPr>
+          <w:p>
+            <w:r>
+              <w:rPr>
+                <w:rFonts w:ascii="Calibri" w:eastAsia="Calibri" w:hAnsi="Calibri" w:cs="Calibri"/>
+              </w:rPr>
+              <w:t xml:space="preserve">26-10-2026</w:t>
+            </w:r>
+          </w:p>
+        </w:tc>
+      </w:tr>
+    </w:tbl>
     <w:p>
       <w:r>
         <w:br w:type="page"/>
@@ -2506,27 +2956,7 @@
           <w:szCs w:val="28"/>
         </w:rPr>
         <w:lastRenderedPageBreak/>
-        <w:t>1</w:t>
-      </w:r>
-      <w:r>
-        <w:rPr>
-          <w:rFonts w:ascii="Calibri" w:eastAsia="Calibri" w:hAnsi="Calibri" w:cs="Calibri"/>
-          <w:b/>
-          <w:bCs/>
-          <w:sz w:val="28"/>
-          <w:szCs w:val="28"/>
-        </w:rPr>
-        <w:t>.</w:t>
-      </w:r>
-      <w:r>
-        <w:rPr>
-          <w:rFonts w:ascii="Calibri" w:eastAsia="Calibri" w:hAnsi="Calibri" w:cs="Calibri"/>
-          <w:b/>
-          <w:bCs/>
-          <w:sz w:val="28"/>
-          <w:szCs w:val="28"/>
-        </w:rPr>
-        <w:t xml:space="preserve"> Introduction</w:t>
+        <w:t xml:space="preserve">1. Introduction</w:t>
       </w:r>
       <w:bookmarkEnd w:id="1"/>
     </w:p>
@@ -3208,23 +3638,7 @@
           <w:sz w:val="22"/>
           <w:szCs w:val="22"/>
         </w:rPr>
-        <w:t xml:space="preserve">Note on motor temperature limits: </w:t>
-      </w:r>
-      <w:r>
-        <w:rPr>
-          <w:rFonts w:ascii="Calibri" w:eastAsia="Calibri" w:hAnsi="Calibri" w:cs="Calibri"/>
-          <w:sz w:val="22"/>
-          <w:szCs w:val="22"/>
-        </w:rPr>
-        <w:t>the motor temperature limits used by this specification (normal below 120°C, warning above 130°C, critical above 150°C)</w:t>
-      </w:r>
-      <w:r>
-        <w:rPr>
-          <w:rFonts w:ascii="Calibri" w:eastAsia="Calibri" w:hAnsi="Calibri" w:cs="Calibri"/>
-          <w:sz w:val="22"/>
-          <w:szCs w:val="22"/>
-        </w:rPr>
-        <w:t xml:space="preserve"> are team-selected working values, pending equipment-specific validation. They are not taken directly from IEC 60034-1. An earlier table using a different arrangement of the same figures was reconciled to these values by the group. See Appendix A.1 and A.4.</w:t>
+        <w:t xml:space="preserve">Note on motor temperature limits: the motor temperature limits used by this specification (normal below 120°C, warning above 130°C, critical above 150°C) are team-selected working values, pending equipment-specific validation. They are not taken directly from IEC 60034-1. An earlier table using a different arrangement of the same figures was reconciled to these values by the group. See Appendix A.1 and A.4.</w:t>
       </w:r>
     </w:p>
     <w:p>
@@ -3268,7 +3682,7 @@
           <w:sz w:val="22"/>
           <w:szCs w:val="22"/>
         </w:rPr>
-        <w:t xml:space="preserve">Section 2 describes the system at a high level: its context, its main functions, its intended users, and the assumptions and constraints it operates under. Section 3 specifies detailed, testable requirements. Section 4 specifies external interface requirements. Section 5 covers other requirements. Appendix B records the design decisions made to satisfy these requirements, kept separate from the requirements themselves.</w:t>
+        <w:t xml:space="preserve">Section 2 describes the system at a high level: its context, its main functions, its intended users, and the assumptions and constraints it operates under. Section 3 specifies detailed, testable requirements. Section 4 specifies external interface requirements. Section 5 sets out the acceptance criteria, which are checked in the final demonstration. Section 3.6 covers other requirements. Appendix B records the design decisions made to satisfy these requirements, kept separate from the requirements themselves.</w:t>
       </w:r>
     </w:p>
     <w:p>
@@ -3617,7 +4031,7 @@
               <w:rPr>
                 <w:rFonts w:ascii="Calibri" w:eastAsia="Calibri" w:hAnsi="Calibri" w:cs="Calibri"/>
               </w:rPr>
-              <w:t>Machine Operator</w:t>
+              <w:t xml:space="preserve">Operator</w:t>
             </w:r>
           </w:p>
         </w:tc>
@@ -3636,7 +4050,7 @@
               <w:rPr>
                 <w:rFonts w:ascii="Calibri" w:eastAsia="Calibri" w:hAnsi="Calibri" w:cs="Calibri"/>
               </w:rPr>
-              <w:t>Basic to moderate technical knowledge. Monitors motor and pump operating conditions during production. Needs a simple dashboard showing measurements, machine status, and clear warning/critical alerts. Should not normally change system configuration.</w:t>
+              <w:t xml:space="preserve">Basic to moderate technical knowledge. The first responder on shift: monitors motor and pump operating conditions during production, sees fault alerts, acknowledges them and can generate reports. Needs a simple dashboard showing measurements, machine status, and clear warning/critical alerts. Does not resolve faults, use maintenance mode, change limits or change system configuration.</w:t>
             </w:r>
           </w:p>
         </w:tc>
@@ -3663,7 +4077,7 @@
               <w:rPr>
                 <w:rFonts w:ascii="Calibri" w:eastAsia="Calibri" w:hAnsi="Calibri" w:cs="Calibri"/>
               </w:rPr>
-              <w:t>Maintenance Technician / Engineer</w:t>
+              <w:t xml:space="preserve">Engineer</w:t>
             </w:r>
           </w:p>
         </w:tc>
@@ -3682,7 +4096,7 @@
               <w:rPr>
                 <w:rFonts w:ascii="Calibri" w:eastAsia="Calibri" w:hAnsi="Calibri" w:cs="Calibri"/>
               </w:rPr>
-              <w:t xml:space="preserve">Technical knowledge of industrial motors, pumps, electrical systems, and maintenance. Uses current and historical measurements, trends, and alerts to identify possible faults and plan preventive maintenance. May require access to diagnostic and configuration functions.</w:t>
+              <w:t xml:space="preserve">Technical knowledge of industrial motors, pumps, electrical systems, and maintenance, and often working remotely. Diagnoses and fixes faults. Does everything an Operator does, and also marks faults resolved, places equipment in maintenance mode and changes limits (every change is logged).</w:t>
             </w:r>
           </w:p>
         </w:tc>
@@ -3709,7 +4123,7 @@
               <w:rPr>
                 <w:rFonts w:ascii="Calibri" w:eastAsia="Calibri" w:hAnsi="Calibri" w:cs="Calibri"/>
               </w:rPr>
-              <w:t>System Administrator</w:t>
+              <w:t xml:space="preserve">Administrator</w:t>
             </w:r>
           </w:p>
         </w:tc>
@@ -3728,58 +4142,25 @@
               <w:rPr>
                 <w:rFonts w:ascii="Calibri" w:eastAsia="Calibri" w:hAnsi="Calibri" w:cs="Calibri"/>
               </w:rPr>
-              <w:t xml:space="preserve">Knowledge of the software and basic IT/network administration. Manages user accounts, access permissions, equipment registration, system settings, data storage, and system availability.</w:t>
-            </w:r>
-          </w:p>
-        </w:tc>
-      </w:tr>
-      <w:tr>
-        <w:tblPrEx>
-          <w:tblCellMar>
-            <w:top w:w="0" w:type="dxa"/>
-            <w:bottom w:w="0" w:type="dxa"/>
-          </w:tblCellMar>
-        </w:tblPrEx>
-        <w:tc>
-          <w:tcPr>
-            <w:tcW w:w="2600" w:type="dxa"/>
-            <w:tcMar>
-              <w:top w:w="80" w:type="dxa"/>
-              <w:left w:w="100" w:type="dxa"/>
-              <w:bottom w:w="80" w:type="dxa"/>
-              <w:right w:w="100" w:type="dxa"/>
-            </w:tcMar>
-          </w:tcPr>
-          <w:p>
-            <w:r>
-              <w:rPr>
-                <w:rFonts w:ascii="Calibri" w:eastAsia="Calibri" w:hAnsi="Calibri" w:cs="Calibri"/>
-              </w:rPr>
-              <w:t>Management / Supervisor</w:t>
-            </w:r>
-          </w:p>
-        </w:tc>
-        <w:tc>
-          <w:tcPr>
-            <w:tcW w:w="7100" w:type="dxa"/>
-            <w:tcMar>
-              <w:top w:w="80" w:type="dxa"/>
-              <w:left w:w="100" w:type="dxa"/>
-              <w:bottom w:w="80" w:type="dxa"/>
-              <w:right w:w="100" w:type="dxa"/>
-            </w:tcMar>
-          </w:tcPr>
-          <w:p>
-            <w:r>
-              <w:rPr>
-                <w:rFonts w:ascii="Calibri" w:eastAsia="Calibri" w:hAnsi="Calibri" w:cs="Calibri"/>
-              </w:rPr>
-              <w:t>Requires limited technical interaction. Uses summaries, equipment status, alerts, and historical reports to understand equipment performance, downtime, and maintenance requirements.</w:t>
+              <w:t xml:space="preserve">Knowledge of the software and basic IT/network administration. Manages user accounts, access permissions, equipment registration, system settings and data storage, and receives the storage alert. Is not an operational user: receives no fault alerts and does not acknowledge faults.</w:t>
             </w:r>
           </w:p>
         </w:tc>
       </w:tr>
     </w:tbl>
+    <w:p>
+      <w:pPr>
+        <w:spacing w:after="150"/>
+      </w:pPr>
+      <w:r>
+        <w:rPr>
+          <w:rFonts w:ascii="Calibri" w:eastAsia="Calibri" w:hAnsi="Calibri" w:cs="Calibri"/>
+          <w:sz w:val="22"/>
+          <w:szCs w:val="22"/>
+        </w:rPr>
+        <w:t xml:space="preserve">The system has three roles because it gives three different sets of rights: watching and acknowledging faults (Operator), fixing faults and tuning limits (Engineer), and managing the system (Administrator).</w:t>
+      </w:r>
+    </w:p>
     <w:p>
       <w:pPr>
         <w:pStyle w:val="Heading2"/>
@@ -4133,6 +4514,19 @@
     </w:p>
     <w:p>
       <w:pPr>
+        <w:spacing w:after="150"/>
+      </w:pPr>
+      <w:r>
+        <w:rPr>
+          <w:rFonts w:ascii="Calibri" w:eastAsia="Calibri" w:hAnsi="Calibri" w:cs="Calibri"/>
+          <w:sz w:val="22"/>
+          <w:szCs w:val="22"/>
+        </w:rPr>
+        <w:t xml:space="preserve">FR-3a: The system shall take one reading per second for every monitored parameter on every machine.</w:t>
+      </w:r>
+    </w:p>
+    <w:p>
+      <w:pPr>
         <w:pStyle w:val="Heading3"/>
         <w:spacing w:before="200" w:after="100"/>
       </w:pPr>
@@ -4172,20 +4566,20 @@
           <w:sz w:val="22"/>
           <w:szCs w:val="22"/>
         </w:rPr>
-        <w:t>FR-5: For conditions flagged by FR-4, the system shall classify the condition as normal, warning, or critical using the defined fault-classification method and identify the affected equipment and parameter.</w:t>
-      </w:r>
-    </w:p>
-    <w:p>
-      <w:pPr>
-        <w:spacing w:after="150"/>
-      </w:pPr>
-      <w:r>
-        <w:rPr>
-          <w:rFonts w:ascii="Calibri" w:eastAsia="Calibri" w:hAnsi="Calibri" w:cs="Calibri"/>
-          <w:sz w:val="22"/>
-          <w:szCs w:val="22"/>
-        </w:rPr>
-        <w:t>FR-6: A condition flagged by FR-4 shall not be classified as a fault under FR-5 based on a single abnormal reading alone. The system shall first check whether the abnormal condition holds across [N — number of readings/time window to be agreed] recent readings for that parameter; only if it does shall FR-5 classification and the FR-7 alert proceed. A single abnormal reading that does not repeat is not treated as a fault, and the dashboard's live reading (see NFR-8) is unaffected either way.</w:t>
+        <w:t xml:space="preserve">FR-5: For conditions flagged by FR-4, the system shall classify the condition as normal, warning, or critical using the defined fault-classification method and identify the affected equipment and parameter. Where the limits define only one abnormal level, the system shall classify the condition as normal or abnormal.</w:t>
+      </w:r>
+    </w:p>
+    <w:p>
+      <w:pPr>
+        <w:spacing w:after="150"/>
+      </w:pPr>
+      <w:r>
+        <w:rPr>
+          <w:rFonts w:ascii="Calibri" w:eastAsia="Calibri" w:hAnsi="Calibri" w:cs="Calibri"/>
+          <w:sz w:val="22"/>
+          <w:szCs w:val="22"/>
+        </w:rPr>
+        <w:t xml:space="preserve">FR-6: A condition flagged by FR-4 shall not be classified as a fault under FR-5 based on a single abnormal reading alone. The system shall first check whether the abnormal condition holds across the readings of the latest 10-second window for that parameter; only if it does shall FR-5 classification and the FR-7 alert proceed. A single abnormal reading that does not repeat is not treated as a fault, and the dashboard's live reading (see NFR-8) is unaffected either way.</w:t>
       </w:r>
     </w:p>
     <w:p>
@@ -4229,20 +4623,85 @@
           <w:sz w:val="22"/>
           <w:szCs w:val="22"/>
         </w:rPr>
-        <w:t xml:space="preserve">FR-7: The system shall generate an alert whenever a fault is confirmed and display it on the dashboard, showing the affected equipment, type of fault, and severity.</w:t>
-      </w:r>
-    </w:p>
-    <w:p>
-      <w:pPr>
-        <w:spacing w:after="150"/>
-      </w:pPr>
-      <w:r>
-        <w:rPr>
-          <w:rFonts w:ascii="Calibri" w:eastAsia="Calibri" w:hAnsi="Calibri" w:cs="Calibri"/>
-          <w:sz w:val="22"/>
-          <w:szCs w:val="22"/>
-        </w:rPr>
-        <w:t>FR-8: The system shall allow a user to acknowledge a fault alert.</w:t>
+        <w:t xml:space="preserve">FR-7: When the status model confirms a fault, the system shall show a pop-up alert to every connected Operator and Engineer, whether near-range or remote.</w:t>
+      </w:r>
+    </w:p>
+    <w:p>
+      <w:pPr>
+        <w:spacing w:after="150"/>
+      </w:pPr>
+      <w:r>
+        <w:rPr>
+          <w:rFonts w:ascii="Calibri" w:eastAsia="Calibri" w:hAnsi="Calibri" w:cs="Calibri"/>
+          <w:sz w:val="22"/>
+          <w:szCs w:val="22"/>
+        </w:rPr>
+        <w:t xml:space="preserve">FR-7a: The pop-up shall show the equipment, the parameter, the fault type, the severity and the time.</w:t>
+      </w:r>
+    </w:p>
+    <w:p>
+      <w:pPr>
+        <w:spacing w:after="150"/>
+      </w:pPr>
+      <w:r>
+        <w:rPr>
+          <w:rFonts w:ascii="Calibri" w:eastAsia="Calibri" w:hAnsi="Calibri" w:cs="Calibri"/>
+          <w:sz w:val="22"/>
+          <w:szCs w:val="22"/>
+        </w:rPr>
+        <w:t xml:space="preserve">FR-7b: The system shall not send fault alerts to the Administrator.</w:t>
+      </w:r>
+    </w:p>
+    <w:p>
+      <w:pPr>
+        <w:spacing w:after="150"/>
+      </w:pPr>
+      <w:r>
+        <w:rPr>
+          <w:rFonts w:ascii="Calibri" w:eastAsia="Calibri" w:hAnsi="Calibri" w:cs="Calibri"/>
+          <w:sz w:val="22"/>
+          <w:szCs w:val="22"/>
+        </w:rPr>
+        <w:t xml:space="preserve">FR-7c: If no Operator or Engineer is connected, the fault shall stay open and be shown to the next Operator or Engineer who connects.</w:t>
+      </w:r>
+    </w:p>
+    <w:p>
+      <w:pPr>
+        <w:spacing w:after="150"/>
+      </w:pPr>
+      <w:r>
+        <w:rPr>
+          <w:rFonts w:ascii="Calibri" w:eastAsia="Calibri" w:hAnsi="Calibri" w:cs="Calibri"/>
+          <w:sz w:val="22"/>
+          <w:szCs w:val="22"/>
+        </w:rPr>
+        <w:t xml:space="preserve">FR-8: An Operator or Engineer shall be able to acknowledge an open fault from its alert.</w:t>
+      </w:r>
+    </w:p>
+    <w:p>
+      <w:pPr>
+        <w:spacing w:after="150"/>
+      </w:pPr>
+      <w:r>
+        <w:rPr>
+          <w:rFonts w:ascii="Calibri" w:eastAsia="Calibri" w:hAnsi="Calibri" w:cs="Calibri"/>
+          <w:sz w:val="22"/>
+          <w:szCs w:val="22"/>
+        </w:rPr>
+        <w:t xml:space="preserve">FR-8a: When a fault is acknowledged, the system shall record which user did it and when.</w:t>
+      </w:r>
+    </w:p>
+    <w:p>
+      <w:pPr>
+        <w:spacing w:after="150"/>
+      </w:pPr>
+      <w:r>
+        <w:rPr>
+          <w:rFonts w:ascii="Calibri" w:eastAsia="Calibri" w:hAnsi="Calibri" w:cs="Calibri"/>
+          <w:sz w:val="22"/>
+          <w:szCs w:val="22"/>
+        </w:rPr>
+        <w:t xml:space="preserve">FR-8b: Acknowledging shall not close the fault. It stays open until an Engineer marks it resolved (FR-17).</w:t>
       </w:r>
     </w:p>
     <w:p>
@@ -4286,7 +4745,33 @@
           <w:sz w:val="22"/>
           <w:szCs w:val="22"/>
         </w:rPr>
-        <w:t>FR-10: Authorized users shall be able to access fault history and generate reports showing equipment performance and recurring faults.</w:t>
+        <w:t xml:space="preserve">FR-9a: For every 10-second window, the system shall store the status and its time stamp.</w:t>
+      </w:r>
+    </w:p>
+    <w:p>
+      <w:pPr>
+        <w:spacing w:after="150"/>
+      </w:pPr>
+      <w:r>
+        <w:rPr>
+          <w:rFonts w:ascii="Calibri" w:eastAsia="Calibri" w:hAnsi="Calibri" w:cs="Calibri"/>
+          <w:sz w:val="22"/>
+          <w:szCs w:val="22"/>
+        </w:rPr>
+        <w:t xml:space="preserve">FR-9b: The readings of a normal window shall be deleted after 24 hours. The readings of a warning or critical window shall be kept with their status.</w:t>
+      </w:r>
+    </w:p>
+    <w:p>
+      <w:pPr>
+        <w:spacing w:after="150"/>
+      </w:pPr>
+      <w:r>
+        <w:rPr>
+          <w:rFonts w:ascii="Calibri" w:eastAsia="Calibri" w:hAnsi="Calibri" w:cs="Calibri"/>
+          <w:sz w:val="22"/>
+          <w:szCs w:val="22"/>
+        </w:rPr>
+        <w:t xml:space="preserve">FR-10: All users shall be able to view fault history. Operators and Engineers shall be able to generate reports from fault history showing equipment performance and recurring faults.</w:t>
       </w:r>
     </w:p>
     <w:p>
@@ -4318,15 +4803,7 @@
           <w:sz w:val="22"/>
           <w:szCs w:val="22"/>
         </w:rPr>
-        <w:t xml:space="preserve">FR-11: The system shall support both a near-range and a remote-range connection mode for accessing equipment data from the dashboard. </w:t>
-      </w:r>
-      <w:r>
-        <w:rPr>
-          <w:rFonts w:ascii="Calibri" w:eastAsia="Calibri" w:hAnsi="Calibri" w:cs="Calibri"/>
-          <w:sz w:val="22"/>
-          <w:szCs w:val="22"/>
-        </w:rPr>
-        <w:t>The final demonstration shall provide a selectable simulated mode for each connection type.</w:t>
+        <w:t xml:space="preserve">FR-11: The system shall support both a near-range and a remote-range connection mode for accessing equipment data from the dashboard. The final demonstration shall provide a selectable simulated mode for each connection type.</w:t>
       </w:r>
     </w:p>
     <w:p>
@@ -4382,7 +4859,7 @@
           <w:sz w:val="22"/>
           <w:szCs w:val="22"/>
         </w:rPr>
-        <w:t xml:space="preserve">FR-13: If a piece of equipment stops producing sensor readings for longer than three times its normal reporting interval, the system shall flag that equipment parameter as having a sensor fault and display this on the dashboard, instead of continuing to show the last known reading as current.</w:t>
+        <w:t xml:space="preserve">FR-13: If no reading arrives for a parameter for 3 seconds, the system shall flag that parameter as having a sensor fault and display this on the dashboard, instead of continuing to show the last known reading as current.</w:t>
       </w:r>
     </w:p>
     <w:p>
@@ -4434,7 +4911,7 @@
           <w:sz w:val="22"/>
           <w:szCs w:val="22"/>
         </w:rPr>
-        <w:t xml:space="preserve">FR-17: The system shall support a fault lifecycle of at least: open → acknowledged → resolved. A user shall be able to mark an acknowledged fault as resolved, and the system shall record when this happens.</w:t>
+        <w:t xml:space="preserve">FR-17: The system shall support a fault lifecycle of at least: open → acknowledged → resolved. An Engineer shall be able to mark an acknowledged fault as resolved, and the system shall record when this happens.</w:t>
       </w:r>
     </w:p>
     <w:p>
@@ -4463,7 +4940,7 @@
           <w:sz w:val="22"/>
           <w:szCs w:val="22"/>
         </w:rPr>
-        <w:t xml:space="preserve">FR-18: An authorized user shall be able to place a piece of equipment into maintenance mode for a stated duration, during which the system continues recording sensor readings but suspends new fault alerts for that equipment.</w:t>
+        <w:t xml:space="preserve">FR-18: An Engineer shall be able to place a piece of equipment into maintenance mode for a stated duration, during which the system continues recording sensor readings but suspends new fault alerts for that equipment.</w:t>
       </w:r>
     </w:p>
     <w:p>
@@ -4523,6 +5000,19 @@
     </w:p>
     <w:p>
       <w:pPr>
+        <w:spacing w:after="150"/>
+      </w:pPr>
+      <w:r>
+        <w:rPr>
+          <w:rFonts w:ascii="Calibri" w:eastAsia="Calibri" w:hAnsi="Calibri" w:cs="Calibri"/>
+          <w:sz w:val="22"/>
+          <w:szCs w:val="22"/>
+        </w:rPr>
+        <w:t xml:space="preserve">FR-21a: When storage use reaches 75%, the system shall send an alert to the Administrator only. The Administrator manages storage.</w:t>
+      </w:r>
+    </w:p>
+    <w:p>
+      <w:pPr>
         <w:pStyle w:val="Heading3"/>
         <w:spacing w:before="200" w:after="100"/>
       </w:pPr>
@@ -4565,6 +5055,58 @@
     </w:p>
     <w:p>
       <w:pPr>
+        <w:spacing w:after="150"/>
+      </w:pPr>
+      <w:r>
+        <w:rPr>
+          <w:rFonts w:ascii="Calibri" w:eastAsia="Calibri" w:hAnsi="Calibri" w:cs="Calibri"/>
+          <w:sz w:val="22"/>
+          <w:szCs w:val="22"/>
+        </w:rPr>
+        <w:t xml:space="preserve">FR-23a: An Engineer shall be able to change the warning limit and the critical limit for any parameter of any equipment type, from the dashboard, without restarting or rebuilding the system.</w:t>
+      </w:r>
+    </w:p>
+    <w:p>
+      <w:pPr>
+        <w:spacing w:after="150"/>
+      </w:pPr>
+      <w:r>
+        <w:rPr>
+          <w:rFonts w:ascii="Calibri" w:eastAsia="Calibri" w:hAnsi="Calibri" w:cs="Calibri"/>
+          <w:sz w:val="22"/>
+          <w:szCs w:val="22"/>
+        </w:rPr>
+        <w:t xml:space="preserve">FR-23b: The system shall reject a new limit if the warning limit is not below the critical limit.</w:t>
+      </w:r>
+    </w:p>
+    <w:p>
+      <w:pPr>
+        <w:spacing w:after="150"/>
+      </w:pPr>
+      <w:r>
+        <w:rPr>
+          <w:rFonts w:ascii="Calibri" w:eastAsia="Calibri" w:hAnsi="Calibri" w:cs="Calibri"/>
+          <w:sz w:val="22"/>
+          <w:szCs w:val="22"/>
+        </w:rPr>
+        <w:t xml:space="preserve">FR-23c: A changed limit shall apply to readings received after the change.</w:t>
+      </w:r>
+    </w:p>
+    <w:p>
+      <w:pPr>
+        <w:spacing w:after="150"/>
+      </w:pPr>
+      <w:r>
+        <w:rPr>
+          <w:rFonts w:ascii="Calibri" w:eastAsia="Calibri" w:hAnsi="Calibri" w:cs="Calibri"/>
+          <w:sz w:val="22"/>
+          <w:szCs w:val="22"/>
+        </w:rPr>
+        <w:t xml:space="preserve">FR-23d: Each fault record shall store the limit that was in force when the fault was raised.</w:t>
+      </w:r>
+    </w:p>
+    <w:p>
+      <w:pPr>
         <w:pStyle w:val="Heading3"/>
         <w:spacing w:before="200" w:after="100"/>
       </w:pPr>
@@ -4631,7 +5173,7 @@
           <w:sz w:val="22"/>
           <w:szCs w:val="22"/>
         </w:rPr>
-        <w:t xml:space="preserve">FR-26: A user session shall expire after a period of inactivity, requiring re-authentication before further access.</w:t>
+        <w:t xml:space="preserve">FR-26: A user session shall expire after 5 minutes of inactivity, requiring re-authentication before further access. A user may set a shorter time, but not shorter than 1 minute and not longer than 5 minutes.</w:t>
       </w:r>
     </w:p>
     <w:p>
@@ -4662,7 +5204,7 @@
           <w:sz w:val="22"/>
           <w:szCs w:val="22"/>
         </w:rPr>
-        <w:t>FR-27: The system shall restrict configuration, user-account management, and equipment-registration functions to users in the System Administrator role.</w:t>
+        <w:t>FR-27: The system shall restrict configuration, user-account management, and equipment-registration functions to users in the Administrator role.</w:t>
       </w:r>
     </w:p>
     <w:p>
@@ -4676,6 +5218,84 @@
           <w:szCs w:val="22"/>
         </w:rPr>
         <w:t>FR-28: The system shall require authentication before allowing access to any monitoring or administrative function.</w:t>
+      </w:r>
+    </w:p>
+    <w:p>
+      <w:pPr>
+        <w:spacing w:after="150"/>
+      </w:pPr>
+      <w:r>
+        <w:rPr>
+          <w:rFonts w:ascii="Calibri" w:eastAsia="Calibri" w:hAnsi="Calibri" w:cs="Calibri"/>
+          <w:sz w:val="22"/>
+          <w:szCs w:val="22"/>
+        </w:rPr>
+        <w:t xml:space="preserve">FR-28a: Passwords shall be at least 15 characters long, and the system shall accept passwords of 64 characters or more.</w:t>
+      </w:r>
+    </w:p>
+    <w:p>
+      <w:pPr>
+        <w:spacing w:after="150"/>
+      </w:pPr>
+      <w:r>
+        <w:rPr>
+          <w:rFonts w:ascii="Calibri" w:eastAsia="Calibri" w:hAnsi="Calibri" w:cs="Calibri"/>
+          <w:sz w:val="22"/>
+          <w:szCs w:val="22"/>
+        </w:rPr>
+        <w:t xml:space="preserve">FR-28b: The system shall not require a mix of capitals, numbers or symbols in a password, and shall not force password changes on a schedule.</w:t>
+      </w:r>
+    </w:p>
+    <w:p>
+      <w:pPr>
+        <w:spacing w:after="150"/>
+      </w:pPr>
+      <w:r>
+        <w:rPr>
+          <w:rFonts w:ascii="Calibri" w:eastAsia="Calibri" w:hAnsi="Calibri" w:cs="Calibri"/>
+          <w:sz w:val="22"/>
+          <w:szCs w:val="22"/>
+        </w:rPr>
+        <w:t xml:space="preserve">FR-28c: The system shall refuse passwords that appear on a list of common or leaked passwords.</w:t>
+      </w:r>
+    </w:p>
+    <w:p>
+      <w:pPr>
+        <w:spacing w:after="150"/>
+      </w:pPr>
+      <w:r>
+        <w:rPr>
+          <w:rFonts w:ascii="Calibri" w:eastAsia="Calibri" w:hAnsi="Calibri" w:cs="Calibri"/>
+          <w:sz w:val="22"/>
+          <w:szCs w:val="22"/>
+        </w:rPr>
+        <w:t xml:space="preserve">FR-28d: After 5 failed login attempts on an account, the system should block login to that account for 15 minutes.</w:t>
+      </w:r>
+    </w:p>
+    <w:p>
+      <w:pPr>
+        <w:spacing w:after="150"/>
+      </w:pPr>
+      <w:r>
+        <w:rPr>
+          <w:rFonts w:ascii="Calibri" w:eastAsia="Calibri" w:hAnsi="Calibri" w:cs="Calibri"/>
+          <w:sz w:val="22"/>
+          <w:szCs w:val="22"/>
+        </w:rPr>
+        <w:t xml:space="preserve">FR-28e: All communication between the dashboard and the server shall use HTTPS (TLS 1.2 or newer).</w:t>
+      </w:r>
+    </w:p>
+    <w:p>
+      <w:pPr>
+        <w:spacing w:after="150"/>
+      </w:pPr>
+      <w:r>
+        <w:rPr>
+          <w:rFonts w:ascii="Calibri" w:eastAsia="Calibri" w:hAnsi="Calibri" w:cs="Calibri"/>
+          <w:sz w:val="22"/>
+          <w:szCs w:val="22"/>
+        </w:rPr>
+        <w:t xml:space="preserve">FR-28f: The system shall store passwords only in a salted, hashed form that cannot be read back.</w:t>
       </w:r>
     </w:p>
     <w:p>
@@ -4706,7 +5326,7 @@
           <w:sz w:val="22"/>
           <w:szCs w:val="22"/>
         </w:rPr>
-        <w:t xml:space="preserve">The permissions below apply FR-10 and FR-27. Only the System Administrator role differs from the others: the Machine Operator, Maintenance Technician / Engineer and Management / Supervisor roles all have view and acknowledge access, and only the System Administrator can configure the system, manage users and register equipment.</w:t>
+        <w:t xml:space="preserve">The permissions below apply FR-8, FR-10, FR-17, FR-18, FR-23a and FR-27. The system has three roles because it gives three different sets of rights: watching and acknowledging faults (Operator), fixing faults and tuning limits (Engineer), and managing the system (Administrator).</w:t>
       </w:r>
     </w:p>
     <w:tbl>
@@ -4728,10 +5348,9 @@
       </w:tblPr>
       <w:tblGrid>
         <w:gridCol w:w="3200"/>
-        <w:gridCol w:w="1600"/>
-        <w:gridCol w:w="1900"/>
-        <w:gridCol w:w="1500"/>
-        <w:gridCol w:w="1500"/>
+        <w:gridCol w:w="2166"/>
+        <w:gridCol w:w="2166"/>
+        <w:gridCol w:w="2168"/>
       </w:tblGrid>
       <w:tr>
         <w:tblPrEx>
@@ -4758,13 +5377,13 @@
                 <w:b/>
                 <w:bCs/>
               </w:rPr>
-              <w:t>Function</w:t>
-            </w:r>
-          </w:p>
-        </w:tc>
-        <w:tc>
-          <w:tcPr>
-            <w:tcW w:w="1600" w:type="dxa"/>
+              <w:t xml:space="preserve">Function</w:t>
+            </w:r>
+          </w:p>
+        </w:tc>
+        <w:tc>
+          <w:tcPr>
+            <w:tcW w:w="2166" w:type="dxa"/>
             <w:shd w:val="clear" w:color="auto" w:fill="D9D9D9"/>
             <w:tcMar>
               <w:top w:w="80" w:type="dxa"/>
@@ -4780,13 +5399,13 @@
                 <w:b/>
                 <w:bCs/>
               </w:rPr>
-              <w:t>Machine Operator</w:t>
-            </w:r>
-          </w:p>
-        </w:tc>
-        <w:tc>
-          <w:tcPr>
-            <w:tcW w:w="1900" w:type="dxa"/>
+              <w:t xml:space="preserve">Operator</w:t>
+            </w:r>
+          </w:p>
+        </w:tc>
+        <w:tc>
+          <w:tcPr>
+            <w:tcW w:w="2166" w:type="dxa"/>
             <w:shd w:val="clear" w:color="auto" w:fill="D9D9D9"/>
             <w:tcMar>
               <w:top w:w="80" w:type="dxa"/>
@@ -4802,13 +5421,13 @@
                 <w:b/>
                 <w:bCs/>
               </w:rPr>
-              <w:t>Maint. Tech / Engineer</w:t>
-            </w:r>
-          </w:p>
-        </w:tc>
-        <w:tc>
-          <w:tcPr>
-            <w:tcW w:w="1500" w:type="dxa"/>
+              <w:t xml:space="preserve">Engineer</w:t>
+            </w:r>
+          </w:p>
+        </w:tc>
+        <w:tc>
+          <w:tcPr>
+            <w:tcW w:w="2168" w:type="dxa"/>
             <w:shd w:val="clear" w:color="auto" w:fill="D9D9D9"/>
             <w:tcMar>
               <w:top w:w="80" w:type="dxa"/>
@@ -4824,29 +5443,7 @@
                 <w:b/>
                 <w:bCs/>
               </w:rPr>
-              <w:t>System Admin</w:t>
-            </w:r>
-          </w:p>
-        </w:tc>
-        <w:tc>
-          <w:tcPr>
-            <w:tcW w:w="1500" w:type="dxa"/>
-            <w:shd w:val="clear" w:color="auto" w:fill="D9D9D9"/>
-            <w:tcMar>
-              <w:top w:w="80" w:type="dxa"/>
-              <w:left w:w="100" w:type="dxa"/>
-              <w:bottom w:w="80" w:type="dxa"/>
-              <w:right w:w="100" w:type="dxa"/>
-            </w:tcMar>
-          </w:tcPr>
-          <w:p>
-            <w:r>
-              <w:rPr>
-                <w:rFonts w:ascii="Calibri" w:eastAsia="Calibri" w:hAnsi="Calibri" w:cs="Calibri"/>
-                <w:b/>
-                <w:bCs/>
-              </w:rPr>
-              <w:t xml:space="preserve">Mgmt / Supervisor</w:t>
+              <w:t xml:space="preserve">Administrator</w:t>
             </w:r>
           </w:p>
         </w:tc>
@@ -4879,77 +5476,58 @@
         </w:tc>
         <w:tc>
           <w:tcPr>
-            <w:tcW w:w="1600" w:type="dxa"/>
-            <w:tcMar>
-              <w:top w:w="80" w:type="dxa"/>
-              <w:left w:w="100" w:type="dxa"/>
-              <w:bottom w:w="80" w:type="dxa"/>
-              <w:right w:w="100" w:type="dxa"/>
-            </w:tcMar>
-          </w:tcPr>
-          <w:p>
-            <w:r>
-              <w:rPr>
-                <w:rFonts w:ascii="Calibri" w:eastAsia="Calibri" w:hAnsi="Calibri" w:cs="Calibri"/>
-              </w:rPr>
-              <w:t>Yes</w:t>
-            </w:r>
-          </w:p>
-        </w:tc>
-        <w:tc>
-          <w:tcPr>
-            <w:tcW w:w="1900" w:type="dxa"/>
-            <w:tcMar>
-              <w:top w:w="80" w:type="dxa"/>
-              <w:left w:w="100" w:type="dxa"/>
-              <w:bottom w:w="80" w:type="dxa"/>
-              <w:right w:w="100" w:type="dxa"/>
-            </w:tcMar>
-          </w:tcPr>
-          <w:p>
-            <w:r>
-              <w:rPr>
-                <w:rFonts w:ascii="Calibri" w:eastAsia="Calibri" w:hAnsi="Calibri" w:cs="Calibri"/>
-              </w:rPr>
-              <w:t>Yes</w:t>
-            </w:r>
-          </w:p>
-        </w:tc>
-        <w:tc>
-          <w:tcPr>
-            <w:tcW w:w="1500" w:type="dxa"/>
-            <w:tcMar>
-              <w:top w:w="80" w:type="dxa"/>
-              <w:left w:w="100" w:type="dxa"/>
-              <w:bottom w:w="80" w:type="dxa"/>
-              <w:right w:w="100" w:type="dxa"/>
-            </w:tcMar>
-          </w:tcPr>
-          <w:p>
-            <w:r>
-              <w:rPr>
-                <w:rFonts w:ascii="Calibri" w:eastAsia="Calibri" w:hAnsi="Calibri" w:cs="Calibri"/>
-              </w:rPr>
-              <w:t>Yes</w:t>
-            </w:r>
-          </w:p>
-        </w:tc>
-        <w:tc>
-          <w:tcPr>
-            <w:tcW w:w="1500" w:type="dxa"/>
-            <w:tcMar>
-              <w:top w:w="80" w:type="dxa"/>
-              <w:left w:w="100" w:type="dxa"/>
-              <w:bottom w:w="80" w:type="dxa"/>
-              <w:right w:w="100" w:type="dxa"/>
-            </w:tcMar>
-          </w:tcPr>
-          <w:p>
-            <w:r>
-              <w:rPr>
-                <w:rFonts w:ascii="Calibri" w:eastAsia="Calibri" w:hAnsi="Calibri" w:cs="Calibri"/>
-              </w:rPr>
-              <w:t>Yes</w:t>
+            <w:tcW w:w="2166" w:type="dxa"/>
+            <w:tcMar>
+              <w:top w:w="80" w:type="dxa"/>
+              <w:left w:w="100" w:type="dxa"/>
+              <w:bottom w:w="80" w:type="dxa"/>
+              <w:right w:w="100" w:type="dxa"/>
+            </w:tcMar>
+          </w:tcPr>
+          <w:p>
+            <w:r>
+              <w:rPr>
+                <w:rFonts w:ascii="Calibri" w:eastAsia="Calibri" w:hAnsi="Calibri" w:cs="Calibri"/>
+              </w:rPr>
+              <w:t xml:space="preserve">Yes</w:t>
+            </w:r>
+          </w:p>
+        </w:tc>
+        <w:tc>
+          <w:tcPr>
+            <w:tcW w:w="2166" w:type="dxa"/>
+            <w:tcMar>
+              <w:top w:w="80" w:type="dxa"/>
+              <w:left w:w="100" w:type="dxa"/>
+              <w:bottom w:w="80" w:type="dxa"/>
+              <w:right w:w="100" w:type="dxa"/>
+            </w:tcMar>
+          </w:tcPr>
+          <w:p>
+            <w:r>
+              <w:rPr>
+                <w:rFonts w:ascii="Calibri" w:eastAsia="Calibri" w:hAnsi="Calibri" w:cs="Calibri"/>
+              </w:rPr>
+              <w:t xml:space="preserve">Yes</w:t>
+            </w:r>
+          </w:p>
+        </w:tc>
+        <w:tc>
+          <w:tcPr>
+            <w:tcW w:w="2168" w:type="dxa"/>
+            <w:tcMar>
+              <w:top w:w="80" w:type="dxa"/>
+              <w:left w:w="100" w:type="dxa"/>
+              <w:bottom w:w="80" w:type="dxa"/>
+              <w:right w:w="100" w:type="dxa"/>
+            </w:tcMar>
+          </w:tcPr>
+          <w:p>
+            <w:r>
+              <w:rPr>
+                <w:rFonts w:ascii="Calibri" w:eastAsia="Calibri" w:hAnsi="Calibri" w:cs="Calibri"/>
+              </w:rPr>
+              <w:t xml:space="preserve">Yes</w:t>
             </w:r>
           </w:p>
         </w:tc>
@@ -4976,83 +5554,64 @@
               <w:rPr>
                 <w:rFonts w:ascii="Calibri" w:eastAsia="Calibri" w:hAnsi="Calibri" w:cs="Calibri"/>
               </w:rPr>
-              <w:t>Acknowledge fault alerts</w:t>
-            </w:r>
-          </w:p>
-        </w:tc>
-        <w:tc>
-          <w:tcPr>
-            <w:tcW w:w="1600" w:type="dxa"/>
-            <w:tcMar>
-              <w:top w:w="80" w:type="dxa"/>
-              <w:left w:w="100" w:type="dxa"/>
-              <w:bottom w:w="80" w:type="dxa"/>
-              <w:right w:w="100" w:type="dxa"/>
-            </w:tcMar>
-          </w:tcPr>
-          <w:p>
-            <w:r>
-              <w:rPr>
-                <w:rFonts w:ascii="Calibri" w:eastAsia="Calibri" w:hAnsi="Calibri" w:cs="Calibri"/>
-              </w:rPr>
-              <w:t>Yes</w:t>
-            </w:r>
-          </w:p>
-        </w:tc>
-        <w:tc>
-          <w:tcPr>
-            <w:tcW w:w="1900" w:type="dxa"/>
-            <w:tcMar>
-              <w:top w:w="80" w:type="dxa"/>
-              <w:left w:w="100" w:type="dxa"/>
-              <w:bottom w:w="80" w:type="dxa"/>
-              <w:right w:w="100" w:type="dxa"/>
-            </w:tcMar>
-          </w:tcPr>
-          <w:p>
-            <w:r>
-              <w:rPr>
-                <w:rFonts w:ascii="Calibri" w:eastAsia="Calibri" w:hAnsi="Calibri" w:cs="Calibri"/>
-              </w:rPr>
-              <w:t>Yes</w:t>
-            </w:r>
-          </w:p>
-        </w:tc>
-        <w:tc>
-          <w:tcPr>
-            <w:tcW w:w="1500" w:type="dxa"/>
-            <w:tcMar>
-              <w:top w:w="80" w:type="dxa"/>
-              <w:left w:w="100" w:type="dxa"/>
-              <w:bottom w:w="80" w:type="dxa"/>
-              <w:right w:w="100" w:type="dxa"/>
-            </w:tcMar>
-          </w:tcPr>
-          <w:p>
-            <w:r>
-              <w:rPr>
-                <w:rFonts w:ascii="Calibri" w:eastAsia="Calibri" w:hAnsi="Calibri" w:cs="Calibri"/>
-              </w:rPr>
-              <w:t>Yes</w:t>
-            </w:r>
-          </w:p>
-        </w:tc>
-        <w:tc>
-          <w:tcPr>
-            <w:tcW w:w="1500" w:type="dxa"/>
-            <w:tcMar>
-              <w:top w:w="80" w:type="dxa"/>
-              <w:left w:w="100" w:type="dxa"/>
-              <w:bottom w:w="80" w:type="dxa"/>
-              <w:right w:w="100" w:type="dxa"/>
-            </w:tcMar>
-          </w:tcPr>
-          <w:p>
-            <w:r>
-              <w:rPr>
-                <w:rFonts w:ascii="Calibri" w:eastAsia="Calibri" w:hAnsi="Calibri" w:cs="Calibri"/>
-              </w:rPr>
-              <w:t>Yes</w:t>
+              <w:t xml:space="preserve">See fault pop-ups</w:t>
+            </w:r>
+          </w:p>
+        </w:tc>
+        <w:tc>
+          <w:tcPr>
+            <w:tcW w:w="2166" w:type="dxa"/>
+            <w:tcMar>
+              <w:top w:w="80" w:type="dxa"/>
+              <w:left w:w="100" w:type="dxa"/>
+              <w:bottom w:w="80" w:type="dxa"/>
+              <w:right w:w="100" w:type="dxa"/>
+            </w:tcMar>
+          </w:tcPr>
+          <w:p>
+            <w:r>
+              <w:rPr>
+                <w:rFonts w:ascii="Calibri" w:eastAsia="Calibri" w:hAnsi="Calibri" w:cs="Calibri"/>
+              </w:rPr>
+              <w:t xml:space="preserve">Yes</w:t>
+            </w:r>
+          </w:p>
+        </w:tc>
+        <w:tc>
+          <w:tcPr>
+            <w:tcW w:w="2166" w:type="dxa"/>
+            <w:tcMar>
+              <w:top w:w="80" w:type="dxa"/>
+              <w:left w:w="100" w:type="dxa"/>
+              <w:bottom w:w="80" w:type="dxa"/>
+              <w:right w:w="100" w:type="dxa"/>
+            </w:tcMar>
+          </w:tcPr>
+          <w:p>
+            <w:r>
+              <w:rPr>
+                <w:rFonts w:ascii="Calibri" w:eastAsia="Calibri" w:hAnsi="Calibri" w:cs="Calibri"/>
+              </w:rPr>
+              <w:t xml:space="preserve">Yes</w:t>
+            </w:r>
+          </w:p>
+        </w:tc>
+        <w:tc>
+          <w:tcPr>
+            <w:tcW w:w="2168" w:type="dxa"/>
+            <w:tcMar>
+              <w:top w:w="80" w:type="dxa"/>
+              <w:left w:w="100" w:type="dxa"/>
+              <w:bottom w:w="80" w:type="dxa"/>
+              <w:right w:w="100" w:type="dxa"/>
+            </w:tcMar>
+          </w:tcPr>
+          <w:p>
+            <w:r>
+              <w:rPr>
+                <w:rFonts w:ascii="Calibri" w:eastAsia="Calibri" w:hAnsi="Calibri" w:cs="Calibri"/>
+              </w:rPr>
+              <w:t xml:space="preserve">No</w:t>
             </w:r>
           </w:p>
         </w:tc>
@@ -5079,83 +5638,64 @@
               <w:rPr>
                 <w:rFonts w:ascii="Calibri" w:eastAsia="Calibri" w:hAnsi="Calibri" w:cs="Calibri"/>
               </w:rPr>
-              <w:t>Generate reports from fault history</w:t>
-            </w:r>
-          </w:p>
-        </w:tc>
-        <w:tc>
-          <w:tcPr>
-            <w:tcW w:w="1600" w:type="dxa"/>
-            <w:tcMar>
-              <w:top w:w="80" w:type="dxa"/>
-              <w:left w:w="100" w:type="dxa"/>
-              <w:bottom w:w="80" w:type="dxa"/>
-              <w:right w:w="100" w:type="dxa"/>
-            </w:tcMar>
-          </w:tcPr>
-          <w:p>
-            <w:r>
-              <w:rPr>
-                <w:rFonts w:ascii="Calibri" w:eastAsia="Calibri" w:hAnsi="Calibri" w:cs="Calibri"/>
-              </w:rPr>
-              <w:t>Yes</w:t>
-            </w:r>
-          </w:p>
-        </w:tc>
-        <w:tc>
-          <w:tcPr>
-            <w:tcW w:w="1900" w:type="dxa"/>
-            <w:tcMar>
-              <w:top w:w="80" w:type="dxa"/>
-              <w:left w:w="100" w:type="dxa"/>
-              <w:bottom w:w="80" w:type="dxa"/>
-              <w:right w:w="100" w:type="dxa"/>
-            </w:tcMar>
-          </w:tcPr>
-          <w:p>
-            <w:r>
-              <w:rPr>
-                <w:rFonts w:ascii="Calibri" w:eastAsia="Calibri" w:hAnsi="Calibri" w:cs="Calibri"/>
-              </w:rPr>
-              <w:t>Yes</w:t>
-            </w:r>
-          </w:p>
-        </w:tc>
-        <w:tc>
-          <w:tcPr>
-            <w:tcW w:w="1500" w:type="dxa"/>
-            <w:tcMar>
-              <w:top w:w="80" w:type="dxa"/>
-              <w:left w:w="100" w:type="dxa"/>
-              <w:bottom w:w="80" w:type="dxa"/>
-              <w:right w:w="100" w:type="dxa"/>
-            </w:tcMar>
-          </w:tcPr>
-          <w:p>
-            <w:r>
-              <w:rPr>
-                <w:rFonts w:ascii="Calibri" w:eastAsia="Calibri" w:hAnsi="Calibri" w:cs="Calibri"/>
-              </w:rPr>
-              <w:t>Yes</w:t>
-            </w:r>
-          </w:p>
-        </w:tc>
-        <w:tc>
-          <w:tcPr>
-            <w:tcW w:w="1500" w:type="dxa"/>
-            <w:tcMar>
-              <w:top w:w="80" w:type="dxa"/>
-              <w:left w:w="100" w:type="dxa"/>
-              <w:bottom w:w="80" w:type="dxa"/>
-              <w:right w:w="100" w:type="dxa"/>
-            </w:tcMar>
-          </w:tcPr>
-          <w:p>
-            <w:r>
-              <w:rPr>
-                <w:rFonts w:ascii="Calibri" w:eastAsia="Calibri" w:hAnsi="Calibri" w:cs="Calibri"/>
-              </w:rPr>
-              <w:t>Yes</w:t>
+              <w:t xml:space="preserve">Acknowledge a fault</w:t>
+            </w:r>
+          </w:p>
+        </w:tc>
+        <w:tc>
+          <w:tcPr>
+            <w:tcW w:w="2166" w:type="dxa"/>
+            <w:tcMar>
+              <w:top w:w="80" w:type="dxa"/>
+              <w:left w:w="100" w:type="dxa"/>
+              <w:bottom w:w="80" w:type="dxa"/>
+              <w:right w:w="100" w:type="dxa"/>
+            </w:tcMar>
+          </w:tcPr>
+          <w:p>
+            <w:r>
+              <w:rPr>
+                <w:rFonts w:ascii="Calibri" w:eastAsia="Calibri" w:hAnsi="Calibri" w:cs="Calibri"/>
+              </w:rPr>
+              <w:t xml:space="preserve">Yes</w:t>
+            </w:r>
+          </w:p>
+        </w:tc>
+        <w:tc>
+          <w:tcPr>
+            <w:tcW w:w="2166" w:type="dxa"/>
+            <w:tcMar>
+              <w:top w:w="80" w:type="dxa"/>
+              <w:left w:w="100" w:type="dxa"/>
+              <w:bottom w:w="80" w:type="dxa"/>
+              <w:right w:w="100" w:type="dxa"/>
+            </w:tcMar>
+          </w:tcPr>
+          <w:p>
+            <w:r>
+              <w:rPr>
+                <w:rFonts w:ascii="Calibri" w:eastAsia="Calibri" w:hAnsi="Calibri" w:cs="Calibri"/>
+              </w:rPr>
+              <w:t xml:space="preserve">Yes</w:t>
+            </w:r>
+          </w:p>
+        </w:tc>
+        <w:tc>
+          <w:tcPr>
+            <w:tcW w:w="2168" w:type="dxa"/>
+            <w:tcMar>
+              <w:top w:w="80" w:type="dxa"/>
+              <w:left w:w="100" w:type="dxa"/>
+              <w:bottom w:w="80" w:type="dxa"/>
+              <w:right w:w="100" w:type="dxa"/>
+            </w:tcMar>
+          </w:tcPr>
+          <w:p>
+            <w:r>
+              <w:rPr>
+                <w:rFonts w:ascii="Calibri" w:eastAsia="Calibri" w:hAnsi="Calibri" w:cs="Calibri"/>
+              </w:rPr>
+              <w:t xml:space="preserve">No</w:t>
             </w:r>
           </w:p>
         </w:tc>
@@ -5182,83 +5722,64 @@
               <w:rPr>
                 <w:rFonts w:ascii="Calibri" w:eastAsia="Calibri" w:hAnsi="Calibri" w:cs="Calibri"/>
               </w:rPr>
-              <w:t>System configuration</w:t>
-            </w:r>
-          </w:p>
-        </w:tc>
-        <w:tc>
-          <w:tcPr>
-            <w:tcW w:w="1600" w:type="dxa"/>
-            <w:tcMar>
-              <w:top w:w="80" w:type="dxa"/>
-              <w:left w:w="100" w:type="dxa"/>
-              <w:bottom w:w="80" w:type="dxa"/>
-              <w:right w:w="100" w:type="dxa"/>
-            </w:tcMar>
-          </w:tcPr>
-          <w:p>
-            <w:r>
-              <w:rPr>
-                <w:rFonts w:ascii="Calibri" w:eastAsia="Calibri" w:hAnsi="Calibri" w:cs="Calibri"/>
-              </w:rPr>
-              <w:t>No</w:t>
-            </w:r>
-          </w:p>
-        </w:tc>
-        <w:tc>
-          <w:tcPr>
-            <w:tcW w:w="1900" w:type="dxa"/>
-            <w:tcMar>
-              <w:top w:w="80" w:type="dxa"/>
-              <w:left w:w="100" w:type="dxa"/>
-              <w:bottom w:w="80" w:type="dxa"/>
-              <w:right w:w="100" w:type="dxa"/>
-            </w:tcMar>
-          </w:tcPr>
-          <w:p>
-            <w:r>
-              <w:rPr>
-                <w:rFonts w:ascii="Calibri" w:eastAsia="Calibri" w:hAnsi="Calibri" w:cs="Calibri"/>
-              </w:rPr>
-              <w:t>No</w:t>
-            </w:r>
-          </w:p>
-        </w:tc>
-        <w:tc>
-          <w:tcPr>
-            <w:tcW w:w="1500" w:type="dxa"/>
-            <w:tcMar>
-              <w:top w:w="80" w:type="dxa"/>
-              <w:left w:w="100" w:type="dxa"/>
-              <w:bottom w:w="80" w:type="dxa"/>
-              <w:right w:w="100" w:type="dxa"/>
-            </w:tcMar>
-          </w:tcPr>
-          <w:p>
-            <w:r>
-              <w:rPr>
-                <w:rFonts w:ascii="Calibri" w:eastAsia="Calibri" w:hAnsi="Calibri" w:cs="Calibri"/>
-              </w:rPr>
-              <w:t>Yes</w:t>
-            </w:r>
-          </w:p>
-        </w:tc>
-        <w:tc>
-          <w:tcPr>
-            <w:tcW w:w="1500" w:type="dxa"/>
-            <w:tcMar>
-              <w:top w:w="80" w:type="dxa"/>
-              <w:left w:w="100" w:type="dxa"/>
-              <w:bottom w:w="80" w:type="dxa"/>
-              <w:right w:w="100" w:type="dxa"/>
-            </w:tcMar>
-          </w:tcPr>
-          <w:p>
-            <w:r>
-              <w:rPr>
-                <w:rFonts w:ascii="Calibri" w:eastAsia="Calibri" w:hAnsi="Calibri" w:cs="Calibri"/>
-              </w:rPr>
-              <w:t>No</w:t>
+              <w:t xml:space="preserve">Mark a fault resolved</w:t>
+            </w:r>
+          </w:p>
+        </w:tc>
+        <w:tc>
+          <w:tcPr>
+            <w:tcW w:w="2166" w:type="dxa"/>
+            <w:tcMar>
+              <w:top w:w="80" w:type="dxa"/>
+              <w:left w:w="100" w:type="dxa"/>
+              <w:bottom w:w="80" w:type="dxa"/>
+              <w:right w:w="100" w:type="dxa"/>
+            </w:tcMar>
+          </w:tcPr>
+          <w:p>
+            <w:r>
+              <w:rPr>
+                <w:rFonts w:ascii="Calibri" w:eastAsia="Calibri" w:hAnsi="Calibri" w:cs="Calibri"/>
+              </w:rPr>
+              <w:t xml:space="preserve">No</w:t>
+            </w:r>
+          </w:p>
+        </w:tc>
+        <w:tc>
+          <w:tcPr>
+            <w:tcW w:w="2166" w:type="dxa"/>
+            <w:tcMar>
+              <w:top w:w="80" w:type="dxa"/>
+              <w:left w:w="100" w:type="dxa"/>
+              <w:bottom w:w="80" w:type="dxa"/>
+              <w:right w:w="100" w:type="dxa"/>
+            </w:tcMar>
+          </w:tcPr>
+          <w:p>
+            <w:r>
+              <w:rPr>
+                <w:rFonts w:ascii="Calibri" w:eastAsia="Calibri" w:hAnsi="Calibri" w:cs="Calibri"/>
+              </w:rPr>
+              <w:t xml:space="preserve">Yes</w:t>
+            </w:r>
+          </w:p>
+        </w:tc>
+        <w:tc>
+          <w:tcPr>
+            <w:tcW w:w="2168" w:type="dxa"/>
+            <w:tcMar>
+              <w:top w:w="80" w:type="dxa"/>
+              <w:left w:w="100" w:type="dxa"/>
+              <w:bottom w:w="80" w:type="dxa"/>
+              <w:right w:w="100" w:type="dxa"/>
+            </w:tcMar>
+          </w:tcPr>
+          <w:p>
+            <w:r>
+              <w:rPr>
+                <w:rFonts w:ascii="Calibri" w:eastAsia="Calibri" w:hAnsi="Calibri" w:cs="Calibri"/>
+              </w:rPr>
+              <w:t xml:space="preserve">No</w:t>
             </w:r>
           </w:p>
         </w:tc>
@@ -5285,83 +5806,64 @@
               <w:rPr>
                 <w:rFonts w:ascii="Calibri" w:eastAsia="Calibri" w:hAnsi="Calibri" w:cs="Calibri"/>
               </w:rPr>
-              <w:t>User-account management</w:t>
-            </w:r>
-          </w:p>
-        </w:tc>
-        <w:tc>
-          <w:tcPr>
-            <w:tcW w:w="1600" w:type="dxa"/>
-            <w:tcMar>
-              <w:top w:w="80" w:type="dxa"/>
-              <w:left w:w="100" w:type="dxa"/>
-              <w:bottom w:w="80" w:type="dxa"/>
-              <w:right w:w="100" w:type="dxa"/>
-            </w:tcMar>
-          </w:tcPr>
-          <w:p>
-            <w:r>
-              <w:rPr>
-                <w:rFonts w:ascii="Calibri" w:eastAsia="Calibri" w:hAnsi="Calibri" w:cs="Calibri"/>
-              </w:rPr>
-              <w:t>No</w:t>
-            </w:r>
-          </w:p>
-        </w:tc>
-        <w:tc>
-          <w:tcPr>
-            <w:tcW w:w="1900" w:type="dxa"/>
-            <w:tcMar>
-              <w:top w:w="80" w:type="dxa"/>
-              <w:left w:w="100" w:type="dxa"/>
-              <w:bottom w:w="80" w:type="dxa"/>
-              <w:right w:w="100" w:type="dxa"/>
-            </w:tcMar>
-          </w:tcPr>
-          <w:p>
-            <w:r>
-              <w:rPr>
-                <w:rFonts w:ascii="Calibri" w:eastAsia="Calibri" w:hAnsi="Calibri" w:cs="Calibri"/>
-              </w:rPr>
-              <w:t>No</w:t>
-            </w:r>
-          </w:p>
-        </w:tc>
-        <w:tc>
-          <w:tcPr>
-            <w:tcW w:w="1500" w:type="dxa"/>
-            <w:tcMar>
-              <w:top w:w="80" w:type="dxa"/>
-              <w:left w:w="100" w:type="dxa"/>
-              <w:bottom w:w="80" w:type="dxa"/>
-              <w:right w:w="100" w:type="dxa"/>
-            </w:tcMar>
-          </w:tcPr>
-          <w:p>
-            <w:r>
-              <w:rPr>
-                <w:rFonts w:ascii="Calibri" w:eastAsia="Calibri" w:hAnsi="Calibri" w:cs="Calibri"/>
-              </w:rPr>
-              <w:t>Yes</w:t>
-            </w:r>
-          </w:p>
-        </w:tc>
-        <w:tc>
-          <w:tcPr>
-            <w:tcW w:w="1500" w:type="dxa"/>
-            <w:tcMar>
-              <w:top w:w="80" w:type="dxa"/>
-              <w:left w:w="100" w:type="dxa"/>
-              <w:bottom w:w="80" w:type="dxa"/>
-              <w:right w:w="100" w:type="dxa"/>
-            </w:tcMar>
-          </w:tcPr>
-          <w:p>
-            <w:r>
-              <w:rPr>
-                <w:rFonts w:ascii="Calibri" w:eastAsia="Calibri" w:hAnsi="Calibri" w:cs="Calibri"/>
-              </w:rPr>
-              <w:t>No</w:t>
+              <w:t xml:space="preserve">Put equipment in maintenance mode</w:t>
+            </w:r>
+          </w:p>
+        </w:tc>
+        <w:tc>
+          <w:tcPr>
+            <w:tcW w:w="2166" w:type="dxa"/>
+            <w:tcMar>
+              <w:top w:w="80" w:type="dxa"/>
+              <w:left w:w="100" w:type="dxa"/>
+              <w:bottom w:w="80" w:type="dxa"/>
+              <w:right w:w="100" w:type="dxa"/>
+            </w:tcMar>
+          </w:tcPr>
+          <w:p>
+            <w:r>
+              <w:rPr>
+                <w:rFonts w:ascii="Calibri" w:eastAsia="Calibri" w:hAnsi="Calibri" w:cs="Calibri"/>
+              </w:rPr>
+              <w:t xml:space="preserve">No</w:t>
+            </w:r>
+          </w:p>
+        </w:tc>
+        <w:tc>
+          <w:tcPr>
+            <w:tcW w:w="2166" w:type="dxa"/>
+            <w:tcMar>
+              <w:top w:w="80" w:type="dxa"/>
+              <w:left w:w="100" w:type="dxa"/>
+              <w:bottom w:w="80" w:type="dxa"/>
+              <w:right w:w="100" w:type="dxa"/>
+            </w:tcMar>
+          </w:tcPr>
+          <w:p>
+            <w:r>
+              <w:rPr>
+                <w:rFonts w:ascii="Calibri" w:eastAsia="Calibri" w:hAnsi="Calibri" w:cs="Calibri"/>
+              </w:rPr>
+              <w:t xml:space="preserve">Yes</w:t>
+            </w:r>
+          </w:p>
+        </w:tc>
+        <w:tc>
+          <w:tcPr>
+            <w:tcW w:w="2168" w:type="dxa"/>
+            <w:tcMar>
+              <w:top w:w="80" w:type="dxa"/>
+              <w:left w:w="100" w:type="dxa"/>
+              <w:bottom w:w="80" w:type="dxa"/>
+              <w:right w:w="100" w:type="dxa"/>
+            </w:tcMar>
+          </w:tcPr>
+          <w:p>
+            <w:r>
+              <w:rPr>
+                <w:rFonts w:ascii="Calibri" w:eastAsia="Calibri" w:hAnsi="Calibri" w:cs="Calibri"/>
+              </w:rPr>
+              <w:t xml:space="preserve">No</w:t>
             </w:r>
           </w:p>
         </w:tc>
@@ -5388,83 +5890,316 @@
               <w:rPr>
                 <w:rFonts w:ascii="Calibri" w:eastAsia="Calibri" w:hAnsi="Calibri" w:cs="Calibri"/>
               </w:rPr>
-              <w:t>Equipment registration</w:t>
-            </w:r>
-          </w:p>
-        </w:tc>
-        <w:tc>
-          <w:tcPr>
-            <w:tcW w:w="1600" w:type="dxa"/>
-            <w:tcMar>
-              <w:top w:w="80" w:type="dxa"/>
-              <w:left w:w="100" w:type="dxa"/>
-              <w:bottom w:w="80" w:type="dxa"/>
-              <w:right w:w="100" w:type="dxa"/>
-            </w:tcMar>
-          </w:tcPr>
-          <w:p>
-            <w:r>
-              <w:rPr>
-                <w:rFonts w:ascii="Calibri" w:eastAsia="Calibri" w:hAnsi="Calibri" w:cs="Calibri"/>
-              </w:rPr>
-              <w:t>No</w:t>
-            </w:r>
-          </w:p>
-        </w:tc>
-        <w:tc>
-          <w:tcPr>
-            <w:tcW w:w="1900" w:type="dxa"/>
-            <w:tcMar>
-              <w:top w:w="80" w:type="dxa"/>
-              <w:left w:w="100" w:type="dxa"/>
-              <w:bottom w:w="80" w:type="dxa"/>
-              <w:right w:w="100" w:type="dxa"/>
-            </w:tcMar>
-          </w:tcPr>
-          <w:p>
-            <w:r>
-              <w:rPr>
-                <w:rFonts w:ascii="Calibri" w:eastAsia="Calibri" w:hAnsi="Calibri" w:cs="Calibri"/>
-              </w:rPr>
-              <w:t>No</w:t>
-            </w:r>
-          </w:p>
-        </w:tc>
-        <w:tc>
-          <w:tcPr>
-            <w:tcW w:w="1500" w:type="dxa"/>
-            <w:tcMar>
-              <w:top w:w="80" w:type="dxa"/>
-              <w:left w:w="100" w:type="dxa"/>
-              <w:bottom w:w="80" w:type="dxa"/>
-              <w:right w:w="100" w:type="dxa"/>
-            </w:tcMar>
-          </w:tcPr>
-          <w:p>
-            <w:r>
-              <w:rPr>
-                <w:rFonts w:ascii="Calibri" w:eastAsia="Calibri" w:hAnsi="Calibri" w:cs="Calibri"/>
-              </w:rPr>
-              <w:t>Yes</w:t>
-            </w:r>
-          </w:p>
-        </w:tc>
-        <w:tc>
-          <w:tcPr>
-            <w:tcW w:w="1500" w:type="dxa"/>
-            <w:tcMar>
-              <w:top w:w="80" w:type="dxa"/>
-              <w:left w:w="100" w:type="dxa"/>
-              <w:bottom w:w="80" w:type="dxa"/>
-              <w:right w:w="100" w:type="dxa"/>
-            </w:tcMar>
-          </w:tcPr>
-          <w:p>
-            <w:r>
-              <w:rPr>
-                <w:rFonts w:ascii="Calibri" w:eastAsia="Calibri" w:hAnsi="Calibri" w:cs="Calibri"/>
-              </w:rPr>
-              <w:t>No</w:t>
+              <w:t xml:space="preserve">Change limits</w:t>
+            </w:r>
+          </w:p>
+        </w:tc>
+        <w:tc>
+          <w:tcPr>
+            <w:tcW w:w="2166" w:type="dxa"/>
+            <w:tcMar>
+              <w:top w:w="80" w:type="dxa"/>
+              <w:left w:w="100" w:type="dxa"/>
+              <w:bottom w:w="80" w:type="dxa"/>
+              <w:right w:w="100" w:type="dxa"/>
+            </w:tcMar>
+          </w:tcPr>
+          <w:p>
+            <w:r>
+              <w:rPr>
+                <w:rFonts w:ascii="Calibri" w:eastAsia="Calibri" w:hAnsi="Calibri" w:cs="Calibri"/>
+              </w:rPr>
+              <w:t xml:space="preserve">No</w:t>
+            </w:r>
+          </w:p>
+        </w:tc>
+        <w:tc>
+          <w:tcPr>
+            <w:tcW w:w="2166" w:type="dxa"/>
+            <w:tcMar>
+              <w:top w:w="80" w:type="dxa"/>
+              <w:left w:w="100" w:type="dxa"/>
+              <w:bottom w:w="80" w:type="dxa"/>
+              <w:right w:w="100" w:type="dxa"/>
+            </w:tcMar>
+          </w:tcPr>
+          <w:p>
+            <w:r>
+              <w:rPr>
+                <w:rFonts w:ascii="Calibri" w:eastAsia="Calibri" w:hAnsi="Calibri" w:cs="Calibri"/>
+              </w:rPr>
+              <w:t xml:space="preserve">Yes</w:t>
+            </w:r>
+          </w:p>
+        </w:tc>
+        <w:tc>
+          <w:tcPr>
+            <w:tcW w:w="2168" w:type="dxa"/>
+            <w:tcMar>
+              <w:top w:w="80" w:type="dxa"/>
+              <w:left w:w="100" w:type="dxa"/>
+              <w:bottom w:w="80" w:type="dxa"/>
+              <w:right w:w="100" w:type="dxa"/>
+            </w:tcMar>
+          </w:tcPr>
+          <w:p>
+            <w:r>
+              <w:rPr>
+                <w:rFonts w:ascii="Calibri" w:eastAsia="Calibri" w:hAnsi="Calibri" w:cs="Calibri"/>
+              </w:rPr>
+              <w:t xml:space="preserve">No</w:t>
+            </w:r>
+          </w:p>
+        </w:tc>
+      </w:tr>
+      <w:tr>
+        <w:tblPrEx>
+          <w:tblCellMar>
+            <w:top w:w="0" w:type="dxa"/>
+            <w:bottom w:w="0" w:type="dxa"/>
+          </w:tblCellMar>
+        </w:tblPrEx>
+        <w:tc>
+          <w:tcPr>
+            <w:tcW w:w="3200" w:type="dxa"/>
+            <w:tcMar>
+              <w:top w:w="80" w:type="dxa"/>
+              <w:left w:w="100" w:type="dxa"/>
+              <w:bottom w:w="80" w:type="dxa"/>
+              <w:right w:w="100" w:type="dxa"/>
+            </w:tcMar>
+          </w:tcPr>
+          <w:p>
+            <w:r>
+              <w:rPr>
+                <w:rFonts w:ascii="Calibri" w:eastAsia="Calibri" w:hAnsi="Calibri" w:cs="Calibri"/>
+              </w:rPr>
+              <w:t xml:space="preserve">Generate reports from fault history</w:t>
+            </w:r>
+          </w:p>
+        </w:tc>
+        <w:tc>
+          <w:tcPr>
+            <w:tcW w:w="2166" w:type="dxa"/>
+            <w:tcMar>
+              <w:top w:w="80" w:type="dxa"/>
+              <w:left w:w="100" w:type="dxa"/>
+              <w:bottom w:w="80" w:type="dxa"/>
+              <w:right w:w="100" w:type="dxa"/>
+            </w:tcMar>
+          </w:tcPr>
+          <w:p>
+            <w:r>
+              <w:rPr>
+                <w:rFonts w:ascii="Calibri" w:eastAsia="Calibri" w:hAnsi="Calibri" w:cs="Calibri"/>
+              </w:rPr>
+              <w:t xml:space="preserve">Yes</w:t>
+            </w:r>
+          </w:p>
+        </w:tc>
+        <w:tc>
+          <w:tcPr>
+            <w:tcW w:w="2166" w:type="dxa"/>
+            <w:tcMar>
+              <w:top w:w="80" w:type="dxa"/>
+              <w:left w:w="100" w:type="dxa"/>
+              <w:bottom w:w="80" w:type="dxa"/>
+              <w:right w:w="100" w:type="dxa"/>
+            </w:tcMar>
+          </w:tcPr>
+          <w:p>
+            <w:r>
+              <w:rPr>
+                <w:rFonts w:ascii="Calibri" w:eastAsia="Calibri" w:hAnsi="Calibri" w:cs="Calibri"/>
+              </w:rPr>
+              <w:t xml:space="preserve">Yes</w:t>
+            </w:r>
+          </w:p>
+        </w:tc>
+        <w:tc>
+          <w:tcPr>
+            <w:tcW w:w="2168" w:type="dxa"/>
+            <w:tcMar>
+              <w:top w:w="80" w:type="dxa"/>
+              <w:left w:w="100" w:type="dxa"/>
+              <w:bottom w:w="80" w:type="dxa"/>
+              <w:right w:w="100" w:type="dxa"/>
+            </w:tcMar>
+          </w:tcPr>
+          <w:p>
+            <w:r>
+              <w:rPr>
+                <w:rFonts w:ascii="Calibri" w:eastAsia="Calibri" w:hAnsi="Calibri" w:cs="Calibri"/>
+              </w:rPr>
+              <w:t xml:space="preserve">No</w:t>
+            </w:r>
+          </w:p>
+        </w:tc>
+      </w:tr>
+      <w:tr>
+        <w:tblPrEx>
+          <w:tblCellMar>
+            <w:top w:w="0" w:type="dxa"/>
+            <w:bottom w:w="0" w:type="dxa"/>
+          </w:tblCellMar>
+        </w:tblPrEx>
+        <w:tc>
+          <w:tcPr>
+            <w:tcW w:w="3200" w:type="dxa"/>
+            <w:tcMar>
+              <w:top w:w="80" w:type="dxa"/>
+              <w:left w:w="100" w:type="dxa"/>
+              <w:bottom w:w="80" w:type="dxa"/>
+              <w:right w:w="100" w:type="dxa"/>
+            </w:tcMar>
+          </w:tcPr>
+          <w:p>
+            <w:r>
+              <w:rPr>
+                <w:rFonts w:ascii="Calibri" w:eastAsia="Calibri" w:hAnsi="Calibri" w:cs="Calibri"/>
+              </w:rPr>
+              <w:t xml:space="preserve">Manage accounts, equipment registration, system settings and storage</w:t>
+            </w:r>
+          </w:p>
+        </w:tc>
+        <w:tc>
+          <w:tcPr>
+            <w:tcW w:w="2166" w:type="dxa"/>
+            <w:tcMar>
+              <w:top w:w="80" w:type="dxa"/>
+              <w:left w:w="100" w:type="dxa"/>
+              <w:bottom w:w="80" w:type="dxa"/>
+              <w:right w:w="100" w:type="dxa"/>
+            </w:tcMar>
+          </w:tcPr>
+          <w:p>
+            <w:r>
+              <w:rPr>
+                <w:rFonts w:ascii="Calibri" w:eastAsia="Calibri" w:hAnsi="Calibri" w:cs="Calibri"/>
+              </w:rPr>
+              <w:t xml:space="preserve">No</w:t>
+            </w:r>
+          </w:p>
+        </w:tc>
+        <w:tc>
+          <w:tcPr>
+            <w:tcW w:w="2166" w:type="dxa"/>
+            <w:tcMar>
+              <w:top w:w="80" w:type="dxa"/>
+              <w:left w:w="100" w:type="dxa"/>
+              <w:bottom w:w="80" w:type="dxa"/>
+              <w:right w:w="100" w:type="dxa"/>
+            </w:tcMar>
+          </w:tcPr>
+          <w:p>
+            <w:r>
+              <w:rPr>
+                <w:rFonts w:ascii="Calibri" w:eastAsia="Calibri" w:hAnsi="Calibri" w:cs="Calibri"/>
+              </w:rPr>
+              <w:t xml:space="preserve">No</w:t>
+            </w:r>
+          </w:p>
+        </w:tc>
+        <w:tc>
+          <w:tcPr>
+            <w:tcW w:w="2168" w:type="dxa"/>
+            <w:tcMar>
+              <w:top w:w="80" w:type="dxa"/>
+              <w:left w:w="100" w:type="dxa"/>
+              <w:bottom w:w="80" w:type="dxa"/>
+              <w:right w:w="100" w:type="dxa"/>
+            </w:tcMar>
+          </w:tcPr>
+          <w:p>
+            <w:r>
+              <w:rPr>
+                <w:rFonts w:ascii="Calibri" w:eastAsia="Calibri" w:hAnsi="Calibri" w:cs="Calibri"/>
+              </w:rPr>
+              <w:t xml:space="preserve">Yes</w:t>
+            </w:r>
+          </w:p>
+        </w:tc>
+      </w:tr>
+      <w:tr>
+        <w:tblPrEx>
+          <w:tblCellMar>
+            <w:top w:w="0" w:type="dxa"/>
+            <w:bottom w:w="0" w:type="dxa"/>
+          </w:tblCellMar>
+        </w:tblPrEx>
+        <w:tc>
+          <w:tcPr>
+            <w:tcW w:w="3200" w:type="dxa"/>
+            <w:tcMar>
+              <w:top w:w="80" w:type="dxa"/>
+              <w:left w:w="100" w:type="dxa"/>
+              <w:bottom w:w="80" w:type="dxa"/>
+              <w:right w:w="100" w:type="dxa"/>
+            </w:tcMar>
+          </w:tcPr>
+          <w:p>
+            <w:r>
+              <w:rPr>
+                <w:rFonts w:ascii="Calibri" w:eastAsia="Calibri" w:hAnsi="Calibri" w:cs="Calibri"/>
+              </w:rPr>
+              <w:t xml:space="preserve">Receive the 75% storage alert</w:t>
+            </w:r>
+          </w:p>
+        </w:tc>
+        <w:tc>
+          <w:tcPr>
+            <w:tcW w:w="2166" w:type="dxa"/>
+            <w:tcMar>
+              <w:top w:w="80" w:type="dxa"/>
+              <w:left w:w="100" w:type="dxa"/>
+              <w:bottom w:w="80" w:type="dxa"/>
+              <w:right w:w="100" w:type="dxa"/>
+            </w:tcMar>
+          </w:tcPr>
+          <w:p>
+            <w:r>
+              <w:rPr>
+                <w:rFonts w:ascii="Calibri" w:eastAsia="Calibri" w:hAnsi="Calibri" w:cs="Calibri"/>
+              </w:rPr>
+              <w:t xml:space="preserve">No</w:t>
+            </w:r>
+          </w:p>
+        </w:tc>
+        <w:tc>
+          <w:tcPr>
+            <w:tcW w:w="2166" w:type="dxa"/>
+            <w:tcMar>
+              <w:top w:w="80" w:type="dxa"/>
+              <w:left w:w="100" w:type="dxa"/>
+              <w:bottom w:w="80" w:type="dxa"/>
+              <w:right w:w="100" w:type="dxa"/>
+            </w:tcMar>
+          </w:tcPr>
+          <w:p>
+            <w:r>
+              <w:rPr>
+                <w:rFonts w:ascii="Calibri" w:eastAsia="Calibri" w:hAnsi="Calibri" w:cs="Calibri"/>
+              </w:rPr>
+              <w:t xml:space="preserve">No</w:t>
+            </w:r>
+          </w:p>
+        </w:tc>
+        <w:tc>
+          <w:tcPr>
+            <w:tcW w:w="2168" w:type="dxa"/>
+            <w:tcMar>
+              <w:top w:w="80" w:type="dxa"/>
+              <w:left w:w="100" w:type="dxa"/>
+              <w:bottom w:w="80" w:type="dxa"/>
+              <w:right w:w="100" w:type="dxa"/>
+            </w:tcMar>
+          </w:tcPr>
+          <w:p>
+            <w:r>
+              <w:rPr>
+                <w:rFonts w:ascii="Calibri" w:eastAsia="Calibri" w:hAnsi="Calibri" w:cs="Calibri"/>
+              </w:rPr>
+              <w:t xml:space="preserve">Yes</w:t>
             </w:r>
           </w:p>
         </w:tc>
@@ -5549,7 +6284,7 @@
           <w:sz w:val="22"/>
           <w:szCs w:val="22"/>
         </w:rPr>
-        <w:t>Machine Operator</w:t>
+        <w:t>Operator</w:t>
       </w:r>
     </w:p>
     <w:p>
@@ -5785,15 +6520,7 @@
           <w:sz w:val="22"/>
           <w:szCs w:val="22"/>
         </w:rPr>
-        <w:t xml:space="preserve">Primary Actor: </w:t>
-      </w:r>
-      <w:r>
-        <w:rPr>
-          <w:rFonts w:ascii="Calibri" w:eastAsia="Calibri" w:hAnsi="Calibri" w:cs="Calibri"/>
-          <w:sz w:val="22"/>
-          <w:szCs w:val="22"/>
-        </w:rPr>
-        <w:t>System (initiated automatically); Secondary Actor: Machine Operator or Maintenance Technician</w:t>
+        <w:t xml:space="preserve">Primary Actor: System (initiated automatically); Secondary Actor: Operator or Engineer</w:t>
       </w:r>
     </w:p>
     <w:p>
@@ -6119,15 +6846,7 @@
           <w:szCs w:val="22"/>
         </w:rPr>
         <w:lastRenderedPageBreak/>
-        <w:t xml:space="preserve">Primary Actor: </w:t>
-      </w:r>
-      <w:r>
-        <w:rPr>
-          <w:rFonts w:ascii="Calibri" w:eastAsia="Calibri" w:hAnsi="Calibri" w:cs="Calibri"/>
-          <w:sz w:val="22"/>
-          <w:szCs w:val="22"/>
-        </w:rPr>
-        <w:t>Maintenance Technician / Engineer or Management / Supervisor</w:t>
+        <w:t xml:space="preserve">Primary Actor: Operator or Engineer</w:t>
       </w:r>
     </w:p>
     <w:p>
@@ -6614,7 +7333,7 @@
           <w:sz w:val="22"/>
           <w:szCs w:val="22"/>
         </w:rPr>
-        <w:t>System Administrator</w:t>
+        <w:t>Administrator</w:t>
       </w:r>
     </w:p>
     <w:p>
@@ -6660,7 +7379,7 @@
           <w:sz w:val="22"/>
           <w:szCs w:val="22"/>
         </w:rPr>
-        <w:t xml:space="preserve">The user is logged in with the System Administrator role.</w:t>
+        <w:t xml:space="preserve">The user is logged in with the Administrator role.</w:t>
       </w:r>
     </w:p>
     <w:p>
@@ -6762,7 +7481,7 @@
           <w:sz w:val="22"/>
           <w:szCs w:val="22"/>
         </w:rPr>
-        <w:t>1a. A user without the System Administrator role tries to open the administration area: the system denies access (see FR-27, FR-28).</w:t>
+        <w:t>1a. A user without the Administrator role tries to open the administration area: the system denies access (see FR-27, FR-28).</w:t>
       </w:r>
     </w:p>
     <w:p>
@@ -6821,7 +7540,7 @@
           <w:sz w:val="22"/>
           <w:szCs w:val="22"/>
         </w:rPr>
-        <w:t>Maintenance Technician / Engineer</w:t>
+        <w:t>Engineer</w:t>
       </w:r>
     </w:p>
     <w:p>
@@ -6900,7 +7619,7 @@
           <w:sz w:val="22"/>
           <w:szCs w:val="22"/>
         </w:rPr>
-        <w:t>The technician selects a piece of equipment and places it in maintenance mode, stating an expected duration.</w:t>
+        <w:t>The Engineer selects a piece of equipment and places it in maintenance mode, stating an expected duration.</w:t>
       </w:r>
     </w:p>
     <w:p>
@@ -6936,7 +7655,7 @@
           <w:sz w:val="22"/>
           <w:szCs w:val="22"/>
         </w:rPr>
-        <w:t>The technician completes the work and takes the equipment out of maintenance mode.</w:t>
+        <w:t>The Engineer completes the work and takes the equipment out of maintenance mode.</w:t>
       </w:r>
     </w:p>
     <w:p>
@@ -6987,7 +7706,7 @@
           <w:sz w:val="22"/>
           <w:szCs w:val="22"/>
         </w:rPr>
-        <w:t>1a. The stated duration passes and the technician has not ended maintenance mode: the system flags this on the dashboard as overdue rather than leaving the equipment silently unmonitored.</w:t>
+        <w:t>1a. The stated duration passes and the Engineer has not ended maintenance mode: the system flags this on the dashboard as overdue rather than leaving the equipment silently unmonitored.</w:t>
       </w:r>
     </w:p>
     <w:p>
@@ -7073,28 +7792,61 @@
           <w:sz w:val="22"/>
           <w:szCs w:val="22"/>
         </w:rPr>
-        <w:t xml:space="preserve">PR-001: The system shall show a dashboard alert for a critical fault within 60 seconds of that fault being confirmed under FR-6. The 60 seconds is counted from the moment the trend check confirms the fault to the moment the alert appears on the dashboard.</w:t>
-      </w:r>
-    </w:p>
-    <w:p>
-      <w:pPr>
-        <w:spacing w:after="150"/>
-      </w:pPr>
-      <w:r>
-        <w:rPr>
-          <w:rFonts w:ascii="Calibri" w:eastAsia="Calibri" w:hAnsi="Calibri" w:cs="Calibri"/>
-          <w:sz w:val="22"/>
-          <w:szCs w:val="22"/>
-        </w:rPr>
-        <w:t xml:space="preserve">PR-002: </w:t>
-      </w:r>
-      <w:r>
-        <w:rPr>
-          <w:rFonts w:ascii="Calibri" w:eastAsia="Calibri" w:hAnsi="Calibri" w:cs="Calibri"/>
-          <w:sz w:val="22"/>
-          <w:szCs w:val="22"/>
-        </w:rPr>
-        <w:t xml:space="preserve">The dashboard shall show a newly received sensor reading within 2 seconds. The 2 seconds is counted from the moment the processing component receives the reading to the moment it appears on the dashboard, and applies to displaying the reading itself; it does not include the FR-6 trend check that decides whether a warning or critical alert is raised (see PR-001).</w:t>
+        <w:t xml:space="preserve">PR-001: The system shall update the status of each machine at least every 10 seconds.</w:t>
+      </w:r>
+    </w:p>
+    <w:p>
+      <w:pPr>
+        <w:spacing w:after="150"/>
+      </w:pPr>
+      <w:r>
+        <w:rPr>
+          <w:rFonts w:ascii="Calibri" w:eastAsia="Calibri" w:hAnsi="Calibri" w:cs="Calibri"/>
+          <w:sz w:val="22"/>
+          <w:szCs w:val="22"/>
+        </w:rPr>
+        <w:t xml:space="preserve">PR-001a: When the status is critical, the system shall show the alert immediately after the status confirms it, and no later than 2 seconds afterwards. A single abnormal reading never raises an alert (FR-6).</w:t>
+      </w:r>
+    </w:p>
+    <w:p>
+      <w:pPr>
+        <w:spacing w:after="150"/>
+      </w:pPr>
+      <w:r>
+        <w:rPr>
+          <w:rFonts w:ascii="Calibri" w:eastAsia="Calibri" w:hAnsi="Calibri" w:cs="Calibri"/>
+          <w:sz w:val="22"/>
+          <w:szCs w:val="22"/>
+        </w:rPr>
+        <w:t xml:space="preserve">PR-001b: If an alert is shown more than 2 seconds after its status confirms the fault, the system shall still show the alert, write the delay to the log, and show an "alerts delayed" notice on the dashboard.</w:t>
+      </w:r>
+    </w:p>
+    <w:p>
+      <w:pPr>
+        <w:spacing w:after="150"/>
+      </w:pPr>
+      <w:r>
+        <w:rPr>
+          <w:rFonts w:ascii="Calibri" w:eastAsia="Calibri" w:hAnsi="Calibri" w:cs="Calibri"/>
+          <w:i/>
+          <w:iCs/>
+          <w:sz w:val="22"/>
+          <w:szCs w:val="22"/>
+        </w:rPr>
+        <w:t xml:space="preserve">The alert is late only when part of the system is interrupted or slow. The fault is still recorded and stays open, and is shown to the next user who connects. The cost of lateness is that the equipment runs longer before anyone acts.</w:t>
+      </w:r>
+    </w:p>
+    <w:p>
+      <w:pPr>
+        <w:spacing w:after="150"/>
+      </w:pPr>
+      <w:r>
+        <w:rPr>
+          <w:rFonts w:ascii="Calibri" w:eastAsia="Calibri" w:hAnsi="Calibri" w:cs="Calibri"/>
+          <w:sz w:val="22"/>
+          <w:szCs w:val="22"/>
+        </w:rPr>
+        <w:t xml:space="preserve">PR-002: The dashboard shall show a newly received sensor reading within 2 seconds. The 2 seconds is counted from the moment the processing component receives the reading to the moment it appears on the dashboard, and applies to displaying the reading itself; it does not include the FR-6 trend check that decides whether a warning or critical alert is raised (see PR-001).</w:t>
       </w:r>
     </w:p>
     <w:p>
@@ -7151,41 +7903,33 @@
           <w:sz w:val="22"/>
           <w:szCs w:val="22"/>
         </w:rPr>
-        <w:t xml:space="preserve">PR-005: The system shall be able to receive and process at least 1 sensor reading per second across all monitored equipment combined, without breaching PR-001 or PR-002.</w:t>
-      </w:r>
-    </w:p>
-    <w:p>
-      <w:pPr>
-        <w:spacing w:after="150"/>
-      </w:pPr>
-      <w:r>
-        <w:rPr>
-          <w:rFonts w:ascii="Calibri" w:eastAsia="Calibri" w:hAnsi="Calibri" w:cs="Calibri"/>
-          <w:sz w:val="22"/>
-          <w:szCs w:val="22"/>
-        </w:rPr>
-        <w:t xml:space="preserve">PR-006: </w:t>
-      </w:r>
-      <w:r>
-        <w:rPr>
-          <w:rFonts w:ascii="Calibri" w:eastAsia="Calibri" w:hAnsi="Calibri" w:cs="Calibri"/>
-          <w:sz w:val="22"/>
-          <w:szCs w:val="22"/>
-        </w:rPr>
-        <w:t>The data store shall be sized to hold at least 1,296,000 readings without needing to discard data before the 30-day retention period set out in NFR-10 has passed. (This figure assumes 10 pieces of equipment, 3 monitored parameters each, and readings taken once per minute: 10 × 3 × 60 × 24 × 30.)</w:t>
-      </w:r>
-    </w:p>
-    <w:p>
-      <w:pPr>
-        <w:spacing w:after="150"/>
-      </w:pPr>
-      <w:r>
-        <w:rPr>
-          <w:rFonts w:ascii="Calibri" w:eastAsia="Calibri" w:hAnsi="Calibri" w:cs="Calibri"/>
-          <w:sz w:val="22"/>
-          <w:szCs w:val="22"/>
-        </w:rPr>
-        <w:t xml:space="preserve">PR-007: All system components shall complete startup and be actively monitoring equipment within [X seconds/minutes — value to be agreed] of launch.</w:t>
+        <w:t xml:space="preserve">PR-005: The system shall process at least one reading per second for every monitored parameter on every machine, and at least 40 readings per second in total (10 machines × 4 parameters). If a machine has extra parameters, the system shall still keep up, without breaching PR-001 or PR-002.</w:t>
+      </w:r>
+    </w:p>
+    <w:p>
+      <w:pPr>
+        <w:spacing w:after="150"/>
+      </w:pPr>
+      <w:r>
+        <w:rPr>
+          <w:rFonts w:ascii="Calibri" w:eastAsia="Calibri" w:hAnsi="Calibri" w:cs="Calibri"/>
+          <w:sz w:val="22"/>
+          <w:szCs w:val="22"/>
+        </w:rPr>
+        <w:t xml:space="preserve">PR-006: The system shall have room for at least 3,456,000 readings (one day at the minimum load), plus statuses and fault records. (10 machines × 4 parameters × 86,400 seconds in a day. Each extra parameter on 10 machines adds 864,000 a day.)</w:t>
+      </w:r>
+    </w:p>
+    <w:p>
+      <w:pPr>
+        <w:spacing w:after="150"/>
+      </w:pPr>
+      <w:r>
+        <w:rPr>
+          <w:rFonts w:ascii="Calibri" w:eastAsia="Calibri" w:hAnsi="Calibri" w:cs="Calibri"/>
+          <w:sz w:val="22"/>
+          <w:szCs w:val="22"/>
+        </w:rPr>
+        <w:t xml:space="preserve">PR-007: All system components shall complete startup and be actively monitoring equipment within 60 seconds of launch.</w:t>
       </w:r>
     </w:p>
     <w:p>
@@ -7339,7 +8083,7 @@
           <w:sz w:val="22"/>
           <w:szCs w:val="22"/>
         </w:rPr>
-        <w:t xml:space="preserve">DC-006: The system shall be demonstrable without physical sensor hardware or physical access to real industrial equipment.</w:t>
+        <w:t xml:space="preserve">DC-006: The system shall be demonstrable without physical sensor hardware or physical access to real industrial equipment. The system is demonstrated with simulated sensor data and a fault-injection mode, and all tests are run on that simulation.</w:t>
       </w:r>
     </w:p>
     <w:p>
@@ -7491,7 +8235,7 @@
           <w:sz w:val="22"/>
           <w:szCs w:val="22"/>
         </w:rPr>
-        <w:t xml:space="preserve">NFR-6: If the connection between system components is interrupted, the system shall retain all sensor readings generated during the interruption and, once the connection is restored, shall lose no more than 1% of them.</w:t>
+        <w:t xml:space="preserve">NFR-6: The system shall store at least 99% of the sensor readings its data source generates, including during a connection interruption. The local store records the same readings at the same time as the main store, and the same keep and delete rules apply to both.</w:t>
       </w:r>
     </w:p>
     <w:p>
@@ -7612,7 +8356,7 @@
           <w:sz w:val="22"/>
           <w:szCs w:val="22"/>
         </w:rPr>
-        <w:t>NFR-10: The system shall keep sensor readings and fault records for at least 30 days.</w:t>
+        <w:t xml:space="preserve">NFR-10: The system shall keep statuses and warning or critical records until storage use reaches 75%, and shall never delete them automatically. The readings of normal windows are deleted after 24 hours (FR-9b).</w:t>
       </w:r>
     </w:p>
     <w:p>
@@ -7772,20 +8516,20 @@
           <w:sz w:val="22"/>
           <w:szCs w:val="22"/>
         </w:rPr>
-        <w:t xml:space="preserve">The system shall require a user to log in before showing any part of the dashboard (see FR-28). A System Administrator shall manage user accounts, equipment registration, maintenance mode, and thresholds through the same interface (see FR-27, FR-18, FR-23).</w:t>
-      </w:r>
-    </w:p>
-    <w:p>
-      <w:pPr>
-        <w:spacing w:after="150"/>
-      </w:pPr>
-      <w:r>
-        <w:rPr>
-          <w:rFonts w:ascii="Calibri" w:eastAsia="Calibri" w:hAnsi="Calibri" w:cs="Calibri"/>
-          <w:sz w:val="22"/>
-          <w:szCs w:val="22"/>
-        </w:rPr>
-        <w:t xml:space="preserve">The system shall allow authorized users to generate and view fault-history reports for a chosen equipment and date range (see FR-10, UC-3).</w:t>
+        <w:t xml:space="preserve">The system shall require a user to log in before showing any part of the dashboard (see FR-28). An Administrator shall manage user accounts, equipment registration and system settings, and an Engineer shall manage maintenance mode and limits, through the same interface (see FR-27, FR-18, FR-23a).</w:t>
+      </w:r>
+    </w:p>
+    <w:p>
+      <w:pPr>
+        <w:spacing w:after="150"/>
+      </w:pPr>
+      <w:r>
+        <w:rPr>
+          <w:rFonts w:ascii="Calibri" w:eastAsia="Calibri" w:hAnsi="Calibri" w:cs="Calibri"/>
+          <w:sz w:val="22"/>
+          <w:szCs w:val="22"/>
+        </w:rPr>
+        <w:t xml:space="preserve">The system shall allow Operators and Engineers to generate, and all users to view, fault-history reports for a chosen equipment and date range (see FR-10, UC-3).</w:t>
       </w:r>
     </w:p>
     <w:p>
@@ -7960,7 +8704,7 @@
           <w:sz w:val="22"/>
           <w:szCs w:val="22"/>
         </w:rPr>
-        <w:t xml:space="preserve">Each criterion below is demonstrated during the final demonstration and is traceable to the requirements listed against it.</w:t>
+        <w:t xml:space="preserve">Each criterion below is demonstrated during the final demonstration, using simulated sensor data and a fault-injection mode, and is traceable to the requirements listed against it.</w:t>
       </w:r>
     </w:p>
     <w:tbl>
@@ -8100,7 +8844,7 @@
               <w:rPr>
                 <w:rFonts w:ascii="Calibri" w:eastAsia="Calibri" w:hAnsi="Calibri" w:cs="Calibri"/>
               </w:rPr>
-              <w:t>A simulated critical fault produces a dashboard alert within 60 seconds.</w:t>
+              <w:t xml:space="preserve">A simulated critical fault produces a dashboard alert within 2 seconds of its status confirming it, and each machine's status updates at least every 10 seconds.</w:t>
             </w:r>
           </w:p>
         </w:tc>
@@ -8119,7 +8863,7 @@
               <w:rPr>
                 <w:rFonts w:ascii="Calibri" w:eastAsia="Calibri" w:hAnsi="Calibri" w:cs="Calibri"/>
               </w:rPr>
-              <w:t>PR-001, FR-7</w:t>
+              <w:t xml:space="preserve">PR-001, PR-001a, FR-7</w:t>
             </w:r>
           </w:p>
         </w:tc>
@@ -8165,7 +8909,7 @@
               <w:rPr>
                 <w:rFonts w:ascii="Calibri" w:eastAsia="Calibri" w:hAnsi="Calibri" w:cs="Calibri"/>
               </w:rPr>
-              <w:t xml:space="preserve">A System Administrator can perform configuration, user-management and equipment-registration actions; a user in any other role cannot.</w:t>
+              <w:t xml:space="preserve">An Administrator can perform configuration, user-management and equipment-registration actions; a user in any other role cannot.</w:t>
             </w:r>
           </w:p>
         </w:tc>
@@ -8445,6 +9189,136 @@
                 <w:rFonts w:ascii="Calibri" w:eastAsia="Calibri" w:hAnsi="Calibri" w:cs="Calibri"/>
               </w:rPr>
               <w:t>FR-11</w:t>
+            </w:r>
+          </w:p>
+        </w:tc>
+      </w:tr>
+      <w:tr>
+        <w:tblPrEx>
+          <w:tblCellMar>
+            <w:top w:w="0" w:type="dxa"/>
+            <w:bottom w:w="0" w:type="dxa"/>
+          </w:tblCellMar>
+        </w:tblPrEx>
+        <w:tc>
+          <w:tcPr>
+            <w:tcW w:w="900" w:type="dxa"/>
+            <w:tcMar>
+              <w:top w:w="80" w:type="dxa"/>
+              <w:left w:w="100" w:type="dxa"/>
+              <w:bottom w:w="80" w:type="dxa"/>
+              <w:right w:w="100" w:type="dxa"/>
+            </w:tcMar>
+          </w:tcPr>
+          <w:p>
+            <w:r>
+              <w:rPr>
+                <w:rFonts w:ascii="Calibri" w:eastAsia="Calibri" w:hAnsi="Calibri" w:cs="Calibri"/>
+              </w:rPr>
+              <w:t xml:space="preserve">AC-7</w:t>
+            </w:r>
+          </w:p>
+        </w:tc>
+        <w:tc>
+          <w:tcPr>
+            <w:tcW w:w="6200" w:type="dxa"/>
+            <w:tcMar>
+              <w:top w:w="80" w:type="dxa"/>
+              <w:left w:w="100" w:type="dxa"/>
+              <w:bottom w:w="80" w:type="dxa"/>
+              <w:right w:w="100" w:type="dxa"/>
+            </w:tcMar>
+          </w:tcPr>
+          <w:p>
+            <w:r>
+              <w:rPr>
+                <w:rFonts w:ascii="Calibri" w:eastAsia="Calibri" w:hAnsi="Calibri" w:cs="Calibri"/>
+              </w:rPr>
+              <w:t xml:space="preserve">An Engineer can change a warning or critical limit from the dashboard without restarting the system. A new limit whose warning value is not below its critical value is rejected.</w:t>
+            </w:r>
+          </w:p>
+        </w:tc>
+        <w:tc>
+          <w:tcPr>
+            <w:tcW w:w="1700" w:type="dxa"/>
+            <w:tcMar>
+              <w:top w:w="80" w:type="dxa"/>
+              <w:left w:w="100" w:type="dxa"/>
+              <w:bottom w:w="80" w:type="dxa"/>
+              <w:right w:w="100" w:type="dxa"/>
+            </w:tcMar>
+          </w:tcPr>
+          <w:p>
+            <w:r>
+              <w:rPr>
+                <w:rFonts w:ascii="Calibri" w:eastAsia="Calibri" w:hAnsi="Calibri" w:cs="Calibri"/>
+              </w:rPr>
+              <w:t xml:space="preserve">FR-23a, FR-23b</w:t>
+            </w:r>
+          </w:p>
+        </w:tc>
+      </w:tr>
+      <w:tr>
+        <w:tblPrEx>
+          <w:tblCellMar>
+            <w:top w:w="0" w:type="dxa"/>
+            <w:bottom w:w="0" w:type="dxa"/>
+          </w:tblCellMar>
+        </w:tblPrEx>
+        <w:tc>
+          <w:tcPr>
+            <w:tcW w:w="900" w:type="dxa"/>
+            <w:tcMar>
+              <w:top w:w="80" w:type="dxa"/>
+              <w:left w:w="100" w:type="dxa"/>
+              <w:bottom w:w="80" w:type="dxa"/>
+              <w:right w:w="100" w:type="dxa"/>
+            </w:tcMar>
+          </w:tcPr>
+          <w:p>
+            <w:r>
+              <w:rPr>
+                <w:rFonts w:ascii="Calibri" w:eastAsia="Calibri" w:hAnsi="Calibri" w:cs="Calibri"/>
+              </w:rPr>
+              <w:t xml:space="preserve">AC-8</w:t>
+            </w:r>
+          </w:p>
+        </w:tc>
+        <w:tc>
+          <w:tcPr>
+            <w:tcW w:w="6200" w:type="dxa"/>
+            <w:tcMar>
+              <w:top w:w="80" w:type="dxa"/>
+              <w:left w:w="100" w:type="dxa"/>
+              <w:bottom w:w="80" w:type="dxa"/>
+              <w:right w:w="100" w:type="dxa"/>
+            </w:tcMar>
+          </w:tcPr>
+          <w:p>
+            <w:r>
+              <w:rPr>
+                <w:rFonts w:ascii="Calibri" w:eastAsia="Calibri" w:hAnsi="Calibri" w:cs="Calibri"/>
+              </w:rPr>
+              <w:t xml:space="preserve">An alert shown more than 2 seconds late is still shown, is written to the log, and the dashboard shows an "alerts delayed" notice.</w:t>
+            </w:r>
+          </w:p>
+        </w:tc>
+        <w:tc>
+          <w:tcPr>
+            <w:tcW w:w="1700" w:type="dxa"/>
+            <w:tcMar>
+              <w:top w:w="80" w:type="dxa"/>
+              <w:left w:w="100" w:type="dxa"/>
+              <w:bottom w:w="80" w:type="dxa"/>
+              <w:right w:w="100" w:type="dxa"/>
+            </w:tcMar>
+          </w:tcPr>
+          <w:p>
+            <w:r>
+              <w:rPr>
+                <w:rFonts w:ascii="Calibri" w:eastAsia="Calibri" w:hAnsi="Calibri" w:cs="Calibri"/>
+              </w:rPr>
+              <w:t xml:space="preserve">PR-001b</w:t>
             </w:r>
           </w:p>
         </w:tc>
@@ -10425,7 +11299,7 @@
               <w:rPr>
                 <w:rFonts w:ascii="Calibri" w:eastAsia="Calibri" w:hAnsi="Calibri" w:cs="Calibri"/>
               </w:rPr>
-              <w:t xml:space="preserve">A Python backend (Flask or FastAPI) receives simulated sensor data, performs threshold screening, applies the fault-classification logic, and serves the dashboard.</w:t>
+              <w:t xml:space="preserve">A Python backend (Flask) receives simulated sensor data, performs threshold screening, applies the fault-classification logic, and serves the dashboard.</w:t>
             </w:r>
           </w:p>
         </w:tc>
@@ -10590,6 +11464,52 @@
               <w:rPr>
                 <w:rFonts w:ascii="Calibri" w:eastAsia="Calibri" w:hAnsi="Calibri" w:cs="Calibri"/>
               </w:rPr>
+              <w:t xml:space="preserve">Dashboard front end</w:t>
+            </w:r>
+          </w:p>
+        </w:tc>
+        <w:tc>
+          <w:tcPr>
+            <w:tcW w:w="6900" w:type="dxa"/>
+            <w:tcMar>
+              <w:top w:w="80" w:type="dxa"/>
+              <w:left w:w="100" w:type="dxa"/>
+              <w:bottom w:w="80" w:type="dxa"/>
+              <w:right w:w="100" w:type="dxa"/>
+            </w:tcMar>
+          </w:tcPr>
+          <w:p>
+            <w:r>
+              <w:rPr>
+                <w:rFonts w:ascii="Calibri" w:eastAsia="Calibri" w:hAnsi="Calibri" w:cs="Calibri"/>
+              </w:rPr>
+              <w:t xml:space="preserve">The dashboard is built in React using JSX. It talks to the Flask backend over the REST API and WebSocket connection described above.</w:t>
+            </w:r>
+          </w:p>
+        </w:tc>
+      </w:tr>
+      <w:tr>
+        <w:tblPrEx>
+          <w:tblCellMar>
+            <w:top w:w="0" w:type="dxa"/>
+            <w:bottom w:w="0" w:type="dxa"/>
+          </w:tblCellMar>
+        </w:tblPrEx>
+        <w:tc>
+          <w:tcPr>
+            <w:tcW w:w="2600" w:type="dxa"/>
+            <w:tcMar>
+              <w:top w:w="80" w:type="dxa"/>
+              <w:left w:w="100" w:type="dxa"/>
+              <w:bottom w:w="80" w:type="dxa"/>
+              <w:right w:w="100" w:type="dxa"/>
+            </w:tcMar>
+          </w:tcPr>
+          <w:p>
+            <w:r>
+              <w:rPr>
+                <w:rFonts w:ascii="Calibri" w:eastAsia="Calibri" w:hAnsi="Calibri" w:cs="Calibri"/>
+              </w:rPr>
               <w:t>Near-range / remote-range connection mode (FR-11)</w:t>
             </w:r>
           </w:p>
@@ -10986,7 +11906,7 @@
           <w:sz w:val="22"/>
           <w:szCs w:val="22"/>
         </w:rPr>
-        <w:t>Demonstrate the 60-second alert requirement.</w:t>
+        <w:t xml:space="preserve">Demonstrate the 10-second status update and the 2-second critical alert requirement.</w:t>
       </w:r>
     </w:p>
     <w:p>
@@ -11131,7 +12051,7 @@
           <w:sz w:val="22"/>
           <w:szCs w:val="22"/>
         </w:rPr>
-        <w:t>PR-001: Inject a known critical fault into the simulation, record the timestamp at which FR-6 confirms the fault and the dashboard alert timestamp, and confirm the elapsed time is within 60 seconds.</w:t>
+        <w:t xml:space="preserve">PR-001: Inject a known critical fault into the simulation, record the timestamp at which the status confirms the fault and the dashboard alert timestamp, both on the synchronized clock (FR-25), and confirm the elapsed time is 2 seconds or less. Also confirm that each machine's status updates at least every 10 seconds.</w:t>
       </w:r>
     </w:p>
     <w:p>

</xml_diff>

<commit_message>
Make this version 2.0 and drop the revision history from the cover
The 1.x versions were the team's own working versions and never reached the
lecturer, so the cover shows Version 2.0 with no revision history. Docs,
changelog, README and workflow updated; statements file renamed to
docs/v2-clear-statements.md. Text copy refreshed.

Co-Authored-By: Claude Sonnet 5.5 <noreply@anthropic.com>
Claude-Session: https://claude.ai/code/session_01SRX1M5DGSRYirsGnFLCnPL
</commit_message>
<xml_diff>
--- a/srs/SRS_Industrial_Fault_Detection.docx
+++ b/srs/SRS_Industrial_Fault_Detection.docx
@@ -61,7 +61,7 @@
           <w:sz w:val="24"/>
           <w:szCs w:val="24"/>
         </w:rPr>
-        <w:t xml:space="preserve">Version 1.7</w:t>
+        <w:t xml:space="preserve">Version 2.0</w:t>
       </w:r>
     </w:p>
     <w:p>
@@ -106,442 +106,6 @@
         <w:t xml:space="preserve">26-10-2026</w:t>
       </w:r>
     </w:p>
-    <w:p>
-      <w:pPr>
-        <w:spacing w:after="200"/>
-        <w:jc w:val="center"/>
-      </w:pPr>
-      <w:r>
-        <w:rPr>
-          <w:rFonts w:ascii="Calibri" w:eastAsia="Calibri" w:hAnsi="Calibri" w:cs="Calibri"/>
-          <w:sz w:val="22"/>
-          <w:szCs w:val="22"/>
-        </w:rPr>
-        <w:t xml:space="preserve">Revision History</w:t>
-      </w:r>
-    </w:p>
-    <w:tbl>
-      <w:tblPr>
-        <w:tblW w:w="8800" w:type="dxa"/>
-        <w:tblBorders>
-          <w:top w:val="single" w:sz="4" w:space="0" w:color="auto"/>
-          <w:left w:val="single" w:sz="4" w:space="0" w:color="auto"/>
-          <w:bottom w:val="single" w:sz="4" w:space="0" w:color="auto"/>
-          <w:right w:val="single" w:sz="4" w:space="0" w:color="auto"/>
-          <w:insideH w:val="single" w:sz="4" w:space="0" w:color="auto"/>
-          <w:insideV w:val="single" w:sz="4" w:space="0" w:color="auto"/>
-        </w:tblBorders>
-        <w:tblCellMar>
-          <w:left w:w="10" w:type="dxa"/>
-          <w:right w:w="10" w:type="dxa"/>
-        </w:tblCellMar>
-        <w:tblLook w:val="04A0" w:firstRow="1" w:lastRow="0" w:firstColumn="1" w:lastColumn="0" w:noHBand="0" w:noVBand="1"/>
-      </w:tblPr>
-      <w:tblGrid>
-        <w:gridCol w:w="900"/>
-        <w:gridCol w:w="6200"/>
-        <w:gridCol w:w="1700"/>
-      </w:tblGrid>
-      <w:tr>
-        <w:tblPrEx>
-          <w:tblCellMar>
-            <w:top w:w="0" w:type="dxa"/>
-            <w:bottom w:w="0" w:type="dxa"/>
-          </w:tblCellMar>
-        </w:tblPrEx>
-        <w:tc>
-          <w:tcPr>
-            <w:tcW w:w="900" w:type="dxa"/>
-            <w:shd w:val="clear" w:color="auto" w:fill="D9D9D9"/>
-            <w:tcMar>
-              <w:top w:w="80" w:type="dxa"/>
-              <w:left w:w="100" w:type="dxa"/>
-              <w:bottom w:w="80" w:type="dxa"/>
-              <w:right w:w="100" w:type="dxa"/>
-            </w:tcMar>
-          </w:tcPr>
-          <w:p>
-            <w:r>
-              <w:rPr>
-                <w:rFonts w:ascii="Calibri" w:eastAsia="Calibri" w:hAnsi="Calibri" w:cs="Calibri"/>
-                <w:b/>
-                <w:bCs/>
-              </w:rPr>
-              <w:t xml:space="preserve">Version</w:t>
-            </w:r>
-          </w:p>
-        </w:tc>
-        <w:tc>
-          <w:tcPr>
-            <w:tcW w:w="6200" w:type="dxa"/>
-            <w:shd w:val="clear" w:color="auto" w:fill="D9D9D9"/>
-            <w:tcMar>
-              <w:top w:w="80" w:type="dxa"/>
-              <w:left w:w="100" w:type="dxa"/>
-              <w:bottom w:w="80" w:type="dxa"/>
-              <w:right w:w="100" w:type="dxa"/>
-            </w:tcMar>
-          </w:tcPr>
-          <w:p>
-            <w:r>
-              <w:rPr>
-                <w:rFonts w:ascii="Calibri" w:eastAsia="Calibri" w:hAnsi="Calibri" w:cs="Calibri"/>
-                <w:b/>
-                <w:bCs/>
-              </w:rPr>
-              <w:t xml:space="preserve">Changes</w:t>
-            </w:r>
-          </w:p>
-        </w:tc>
-        <w:tc>
-          <w:tcPr>
-            <w:tcW w:w="1700" w:type="dxa"/>
-            <w:shd w:val="clear" w:color="auto" w:fill="D9D9D9"/>
-            <w:tcMar>
-              <w:top w:w="80" w:type="dxa"/>
-              <w:left w:w="100" w:type="dxa"/>
-              <w:bottom w:w="80" w:type="dxa"/>
-              <w:right w:w="100" w:type="dxa"/>
-            </w:tcMar>
-          </w:tcPr>
-          <w:p>
-            <w:r>
-              <w:rPr>
-                <w:rFonts w:ascii="Calibri" w:eastAsia="Calibri" w:hAnsi="Calibri" w:cs="Calibri"/>
-                <w:b/>
-                <w:bCs/>
-              </w:rPr>
-              <w:t xml:space="preserve">Date / tag</w:t>
-            </w:r>
-          </w:p>
-        </w:tc>
-      </w:tr>
-      <w:tr>
-        <w:tblPrEx>
-          <w:tblCellMar>
-            <w:top w:w="0" w:type="dxa"/>
-            <w:bottom w:w="0" w:type="dxa"/>
-          </w:tblCellMar>
-        </w:tblPrEx>
-        <w:tc>
-          <w:tcPr>
-            <w:tcW w:w="900" w:type="dxa"/>
-            <w:tcMar>
-              <w:top w:w="80" w:type="dxa"/>
-              <w:left w:w="100" w:type="dxa"/>
-              <w:bottom w:w="80" w:type="dxa"/>
-              <w:right w:w="100" w:type="dxa"/>
-            </w:tcMar>
-          </w:tcPr>
-          <w:p>
-            <w:r>
-              <w:rPr>
-                <w:rFonts w:ascii="Calibri" w:eastAsia="Calibri" w:hAnsi="Calibri" w:cs="Calibri"/>
-              </w:rPr>
-              <w:t xml:space="preserve">1.3</w:t>
-            </w:r>
-          </w:p>
-        </w:tc>
-        <w:tc>
-          <w:tcPr>
-            <w:tcW w:w="6200" w:type="dxa"/>
-            <w:tcMar>
-              <w:top w:w="80" w:type="dxa"/>
-              <w:left w:w="100" w:type="dxa"/>
-              <w:bottom w:w="80" w:type="dxa"/>
-              <w:right w:w="100" w:type="dxa"/>
-            </w:tcMar>
-          </w:tcPr>
-          <w:p>
-            <w:r>
-              <w:rPr>
-                <w:rFonts w:ascii="Calibri" w:eastAsia="Calibri" w:hAnsi="Calibri" w:cs="Calibri"/>
-              </w:rPr>
-              <w:t xml:space="preserve">The document as received, with margin notes. FR-1 to FR-13 and NFR-1 to NFR-14.</w:t>
-            </w:r>
-          </w:p>
-        </w:tc>
-        <w:tc>
-          <w:tcPr>
-            <w:tcW w:w="1700" w:type="dxa"/>
-            <w:tcMar>
-              <w:top w:w="80" w:type="dxa"/>
-              <w:left w:w="100" w:type="dxa"/>
-              <w:bottom w:w="80" w:type="dxa"/>
-              <w:right w:w="100" w:type="dxa"/>
-            </w:tcMar>
-          </w:tcPr>
-          <w:p>
-            <w:r>
-              <w:rPr>
-                <w:rFonts w:ascii="Calibri" w:eastAsia="Calibri" w:hAnsi="Calibri" w:cs="Calibri"/>
-              </w:rPr>
-              <w:t xml:space="preserve">Tag v1.3</w:t>
-            </w:r>
-          </w:p>
-        </w:tc>
-      </w:tr>
-      <w:tr>
-        <w:tblPrEx>
-          <w:tblCellMar>
-            <w:top w:w="0" w:type="dxa"/>
-            <w:bottom w:w="0" w:type="dxa"/>
-          </w:tblCellMar>
-        </w:tblPrEx>
-        <w:tc>
-          <w:tcPr>
-            <w:tcW w:w="900" w:type="dxa"/>
-            <w:tcMar>
-              <w:top w:w="80" w:type="dxa"/>
-              <w:left w:w="100" w:type="dxa"/>
-              <w:bottom w:w="80" w:type="dxa"/>
-              <w:right w:w="100" w:type="dxa"/>
-            </w:tcMar>
-          </w:tcPr>
-          <w:p>
-            <w:r>
-              <w:rPr>
-                <w:rFonts w:ascii="Calibri" w:eastAsia="Calibri" w:hAnsi="Calibri" w:cs="Calibri"/>
-              </w:rPr>
-              <w:t xml:space="preserve">1.4</w:t>
-            </w:r>
-          </w:p>
-        </w:tc>
-        <w:tc>
-          <w:tcPr>
-            <w:tcW w:w="6200" w:type="dxa"/>
-            <w:tcMar>
-              <w:top w:w="80" w:type="dxa"/>
-              <w:left w:w="100" w:type="dxa"/>
-              <w:bottom w:w="80" w:type="dxa"/>
-              <w:right w:w="100" w:type="dxa"/>
-            </w:tcMar>
-          </w:tcPr>
-          <w:p>
-            <w:r>
-              <w:rPr>
-                <w:rFonts w:ascii="Calibri" w:eastAsia="Calibri" w:hAnsi="Calibri" w:cs="Calibri"/>
-              </w:rPr>
-              <w:t xml:space="preserve">Added FR-14 to FR-27, DC-001 to DC-008 and PR-001 to PR-007. Margin notes resolved.</w:t>
-            </w:r>
-          </w:p>
-        </w:tc>
-        <w:tc>
-          <w:tcPr>
-            <w:tcW w:w="1700" w:type="dxa"/>
-            <w:tcMar>
-              <w:top w:w="80" w:type="dxa"/>
-              <w:left w:w="100" w:type="dxa"/>
-              <w:bottom w:w="80" w:type="dxa"/>
-              <w:right w:w="100" w:type="dxa"/>
-            </w:tcMar>
-          </w:tcPr>
-          <w:p>
-            <w:r>
-              <w:rPr>
-                <w:rFonts w:ascii="Calibri" w:eastAsia="Calibri" w:hAnsi="Calibri" w:cs="Calibri"/>
-              </w:rPr>
-              <w:t xml:space="preserve">Tag v1.4</w:t>
-            </w:r>
-          </w:p>
-        </w:tc>
-      </w:tr>
-      <w:tr>
-        <w:tblPrEx>
-          <w:tblCellMar>
-            <w:top w:w="0" w:type="dxa"/>
-            <w:bottom w:w="0" w:type="dxa"/>
-          </w:tblCellMar>
-        </w:tblPrEx>
-        <w:tc>
-          <w:tcPr>
-            <w:tcW w:w="900" w:type="dxa"/>
-            <w:tcMar>
-              <w:top w:w="80" w:type="dxa"/>
-              <w:left w:w="100" w:type="dxa"/>
-              <w:bottom w:w="80" w:type="dxa"/>
-              <w:right w:w="100" w:type="dxa"/>
-            </w:tcMar>
-          </w:tcPr>
-          <w:p>
-            <w:r>
-              <w:rPr>
-                <w:rFonts w:ascii="Calibri" w:eastAsia="Calibri" w:hAnsi="Calibri" w:cs="Calibri"/>
-              </w:rPr>
-              <w:t xml:space="preserve">1.5</w:t>
-            </w:r>
-          </w:p>
-        </w:tc>
-        <w:tc>
-          <w:tcPr>
-            <w:tcW w:w="6200" w:type="dxa"/>
-            <w:tcMar>
-              <w:top w:w="80" w:type="dxa"/>
-              <w:left w:w="100" w:type="dxa"/>
-              <w:bottom w:w="80" w:type="dxa"/>
-              <w:right w:w="100" w:type="dxa"/>
-            </w:tcMar>
-          </w:tcPr>
-          <w:p>
-            <w:r>
-              <w:rPr>
-                <w:rFonts w:ascii="Calibri" w:eastAsia="Calibri" w:hAnsi="Calibri" w:cs="Calibri"/>
-              </w:rPr>
-              <w:t xml:space="preserve">Non-functional requirements merged into Section 3.5. Sections 3.3 to 3.6 renamed.</w:t>
-            </w:r>
-          </w:p>
-        </w:tc>
-        <w:tc>
-          <w:tcPr>
-            <w:tcW w:w="1700" w:type="dxa"/>
-            <w:tcMar>
-              <w:top w:w="80" w:type="dxa"/>
-              <w:left w:w="100" w:type="dxa"/>
-              <w:bottom w:w="80" w:type="dxa"/>
-              <w:right w:w="100" w:type="dxa"/>
-            </w:tcMar>
-          </w:tcPr>
-          <w:p>
-            <w:r>
-              <w:rPr>
-                <w:rFonts w:ascii="Calibri" w:eastAsia="Calibri" w:hAnsi="Calibri" w:cs="Calibri"/>
-              </w:rPr>
-              <w:t xml:space="preserve">Tag v1.5</w:t>
-            </w:r>
-          </w:p>
-        </w:tc>
-      </w:tr>
-      <w:tr>
-        <w:tblPrEx>
-          <w:tblCellMar>
-            <w:top w:w="0" w:type="dxa"/>
-            <w:bottom w:w="0" w:type="dxa"/>
-          </w:tblCellMar>
-        </w:tblPrEx>
-        <w:tc>
-          <w:tcPr>
-            <w:tcW w:w="900" w:type="dxa"/>
-            <w:tcMar>
-              <w:top w:w="80" w:type="dxa"/>
-              <w:left w:w="100" w:type="dxa"/>
-              <w:bottom w:w="80" w:type="dxa"/>
-              <w:right w:w="100" w:type="dxa"/>
-            </w:tcMar>
-          </w:tcPr>
-          <w:p>
-            <w:r>
-              <w:rPr>
-                <w:rFonts w:ascii="Calibri" w:eastAsia="Calibri" w:hAnsi="Calibri" w:cs="Calibri"/>
-              </w:rPr>
-              <w:t xml:space="preserve">1.6</w:t>
-            </w:r>
-          </w:p>
-        </w:tc>
-        <w:tc>
-          <w:tcPr>
-            <w:tcW w:w="6200" w:type="dxa"/>
-            <w:tcMar>
-              <w:top w:w="80" w:type="dxa"/>
-              <w:left w:w="100" w:type="dxa"/>
-              <w:bottom w:w="80" w:type="dxa"/>
-              <w:right w:w="100" w:type="dxa"/>
-            </w:tcMar>
-          </w:tcPr>
-          <w:p>
-            <w:r>
-              <w:rPr>
-                <w:rFonts w:ascii="Calibri" w:eastAsia="Calibri" w:hAnsi="Calibri" w:cs="Calibri"/>
-              </w:rPr>
-              <w:t xml:space="preserve">Requirements renumbered in page order. New FR-6 (trend check). UC-2 rewritten.</w:t>
-            </w:r>
-          </w:p>
-        </w:tc>
-        <w:tc>
-          <w:tcPr>
-            <w:tcW w:w="1700" w:type="dxa"/>
-            <w:tcMar>
-              <w:top w:w="80" w:type="dxa"/>
-              <w:left w:w="100" w:type="dxa"/>
-              <w:bottom w:w="80" w:type="dxa"/>
-              <w:right w:w="100" w:type="dxa"/>
-            </w:tcMar>
-          </w:tcPr>
-          <w:p>
-            <w:r>
-              <w:rPr>
-                <w:rFonts w:ascii="Calibri" w:eastAsia="Calibri" w:hAnsi="Calibri" w:cs="Calibri"/>
-              </w:rPr>
-              <w:t xml:space="preserve">Tag v1.6</w:t>
-            </w:r>
-          </w:p>
-        </w:tc>
-      </w:tr>
-      <w:tr>
-        <w:tblPrEx>
-          <w:tblCellMar>
-            <w:top w:w="0" w:type="dxa"/>
-            <w:bottom w:w="0" w:type="dxa"/>
-          </w:tblCellMar>
-        </w:tblPrEx>
-        <w:tc>
-          <w:tcPr>
-            <w:tcW w:w="900" w:type="dxa"/>
-            <w:tcMar>
-              <w:top w:w="80" w:type="dxa"/>
-              <w:left w:w="100" w:type="dxa"/>
-              <w:bottom w:w="80" w:type="dxa"/>
-              <w:right w:w="100" w:type="dxa"/>
-            </w:tcMar>
-          </w:tcPr>
-          <w:p>
-            <w:r>
-              <w:rPr>
-                <w:rFonts w:ascii="Calibri" w:eastAsia="Calibri" w:hAnsi="Calibri" w:cs="Calibri"/>
-              </w:rPr>
-              <w:t xml:space="preserve">1.7</w:t>
-            </w:r>
-          </w:p>
-        </w:tc>
-        <w:tc>
-          <w:tcPr>
-            <w:tcW w:w="6200" w:type="dxa"/>
-            <w:tcMar>
-              <w:top w:w="80" w:type="dxa"/>
-              <w:left w:w="100" w:type="dxa"/>
-              <w:bottom w:w="80" w:type="dxa"/>
-              <w:right w:w="100" w:type="dxa"/>
-            </w:tcMar>
-          </w:tcPr>
-          <w:p>
-            <w:r>
-              <w:rPr>
-                <w:rFonts w:ascii="Calibri" w:eastAsia="Calibri" w:hAnsi="Calibri" w:cs="Calibri"/>
-              </w:rPr>
-              <w:t xml:space="preserve">Three roles. Alert and acknowledge rules. Limits can be changed. Security rules. One reading per second and storage rules. Status update every 10 seconds with a critical alert within 2 seconds. Flask and React. Group members added.</w:t>
-            </w:r>
-          </w:p>
-        </w:tc>
-        <w:tc>
-          <w:tcPr>
-            <w:tcW w:w="1700" w:type="dxa"/>
-            <w:tcMar>
-              <w:top w:w="80" w:type="dxa"/>
-              <w:left w:w="100" w:type="dxa"/>
-              <w:bottom w:w="80" w:type="dxa"/>
-              <w:right w:w="100" w:type="dxa"/>
-            </w:tcMar>
-          </w:tcPr>
-          <w:p>
-            <w:r>
-              <w:rPr>
-                <w:rFonts w:ascii="Calibri" w:eastAsia="Calibri" w:hAnsi="Calibri" w:cs="Calibri"/>
-              </w:rPr>
-              <w:t xml:space="preserve">26-10-2026</w:t>
-            </w:r>
-          </w:p>
-        </w:tc>
-      </w:tr>
-    </w:tbl>
     <w:p>
       <w:r>
         <w:br w:type="page"/>

</xml_diff>

<commit_message>
Add context and use-case diagrams to the SRS
Figure 1 (context, Section 2.1) and Figure 2 (use-case, Section 3.2), drawn in
the lecturer's UML style and checked against UC-1 to UC-6, the role table and
Section 4. Every oval label equals its use-case heading. A geometry check in
the drawing script fails if a line crosses an oval it does not belong to.

Text fixes so the document and diagrams agree: UC-1 actor line, UC-2 step 6
(FR-7a) and step 7a (FR-8b, FR-17). Diagram sources saved in docs/diagrams.

Co-Authored-By: Claude Sonnet 5.5 <noreply@anthropic.com>
Claude-Session: https://claude.ai/code/session_01SRX1M5DGSRYirsGnFLCnPL
</commit_message>
<xml_diff>
--- a/srs/SRS_Industrial_Fault_Detection.docx
+++ b/srs/SRS_Industrial_Fault_Detection.docx
@@ -3301,6 +3301,61 @@
     </w:p>
     <w:p>
       <w:pPr>
+        <w:keepNext/>
+        <w:spacing w:before="120"/>
+        <w:jc w:val="center"/>
+      </w:pPr>
+      <w:r>
+        <w:drawing>
+          <wp:inline xmlns:a="http://schemas.openxmlformats.org/drawingml/2006/main" xmlns:pic="http://schemas.openxmlformats.org/drawingml/2006/picture">
+            <wp:extent cx="5943600" cy="4287883"/>
+            <wp:docPr id="1" name="Figure 1" descr="Context diagram: the equipment data source sends sensor readings to the system. The system sends status, readings, fault history, reports and fault pop-ups to the Operator and Engineer, and status, readings, fault history and the storage alert to the Administrator. Each user sends login details and their actions back."/>
+            <wp:cNvGraphicFramePr>
+              <a:graphicFrameLocks noChangeAspect="1"/>
+            </wp:cNvGraphicFramePr>
+            <a:graphic>
+              <a:graphicData uri="http://schemas.openxmlformats.org/drawingml/2006/picture">
+                <pic:pic>
+                  <pic:nvPicPr>
+                    <pic:cNvPr id="0" name="context-diagram.png"/>
+                    <pic:cNvPicPr/>
+                  </pic:nvPicPr>
+                  <pic:blipFill>
+                    <a:blip r:embed="rId11"/>
+                    <a:stretch>
+                      <a:fillRect/>
+                    </a:stretch>
+                  </pic:blipFill>
+                  <pic:spPr>
+                    <a:xfrm>
+                      <a:off x="0" y="0"/>
+                      <a:ext cx="5943600" cy="4287883"/>
+                    </a:xfrm>
+                    <a:prstGeom prst="rect"/>
+                  </pic:spPr>
+                </pic:pic>
+              </a:graphicData>
+            </a:graphic>
+          </wp:inline>
+        </w:drawing>
+      </w:r>
+    </w:p>
+    <w:p>
+      <w:pPr>
+        <w:spacing w:after="200"/>
+        <w:jc w:val="center"/>
+      </w:pPr>
+      <w:r>
+        <w:rPr>
+          <w:rFonts w:ascii="Calibri" w:hAnsi="Calibri" w:eastAsia="Calibri" w:cs="Calibri"/>
+          <w:i/>
+          <w:sz w:val="20"/>
+        </w:rPr>
+        <w:t>Figure 1: Context diagram. The system, the three user roles and the simulated equipment data source, with what passes between them.</w:t>
+      </w:r>
+    </w:p>
+    <w:p>
+      <w:pPr>
         <w:spacing w:after="150"/>
       </w:pPr>
       <w:r>
@@ -5807,6 +5862,61 @@
     </w:p>
     <w:p>
       <w:pPr>
+        <w:keepNext/>
+        <w:spacing w:before="120"/>
+        <w:jc w:val="center"/>
+      </w:pPr>
+      <w:r>
+        <w:drawing>
+          <wp:inline xmlns:a="http://schemas.openxmlformats.org/drawingml/2006/main" xmlns:pic="http://schemas.openxmlformats.org/drawingml/2006/picture">
+            <wp:extent cx="5120640" cy="4751954"/>
+            <wp:docPr id="2" name="Figure 2" descr="Use-case diagram: the Operator takes part in UC-1, UC-2 and UC-3. The Engineer takes part in UC-6 and has every right the Operator has. The Administrator takes part in UC-1 and UC-5. UC-4 starts automatically."/>
+            <wp:cNvGraphicFramePr>
+              <a:graphicFrameLocks noChangeAspect="1"/>
+            </wp:cNvGraphicFramePr>
+            <a:graphic>
+              <a:graphicData uri="http://schemas.openxmlformats.org/drawingml/2006/picture">
+                <pic:pic>
+                  <pic:nvPicPr>
+                    <pic:cNvPr id="0" name="use-case-diagram.png"/>
+                    <pic:cNvPicPr/>
+                  </pic:nvPicPr>
+                  <pic:blipFill>
+                    <a:blip r:embed="rId12"/>
+                    <a:stretch>
+                      <a:fillRect/>
+                    </a:stretch>
+                  </pic:blipFill>
+                  <pic:spPr>
+                    <a:xfrm>
+                      <a:off x="0" y="0"/>
+                      <a:ext cx="5120640" cy="4751954"/>
+                    </a:xfrm>
+                    <a:prstGeom prst="rect"/>
+                  </pic:spPr>
+                </pic:pic>
+              </a:graphicData>
+            </a:graphic>
+          </wp:inline>
+        </w:drawing>
+      </w:r>
+    </w:p>
+    <w:p>
+      <w:pPr>
+        <w:spacing w:after="200"/>
+        <w:jc w:val="center"/>
+      </w:pPr>
+      <w:r>
+        <w:rPr>
+          <w:rFonts w:ascii="Calibri" w:hAnsi="Calibri" w:eastAsia="Calibri" w:cs="Calibri"/>
+          <w:i/>
+          <w:sz w:val="20"/>
+        </w:rPr>
+        <w:t>Figure 2: Use-case diagram. The three roles and the six use cases of this section. The Engineer has every right the Operator has.</w:t>
+      </w:r>
+    </w:p>
+    <w:p>
+      <w:pPr>
         <w:spacing w:after="150"/>
       </w:pPr>
     </w:p>
@@ -5848,7 +5958,7 @@
           <w:sz w:val="22"/>
           <w:szCs w:val="22"/>
         </w:rPr>
-        <w:t>Operator</w:t>
+        <w:t>Operator (the Engineer and Administrator can also view equipment status; see Section 3.1.1)</w:t>
       </w:r>
     </w:p>
     <w:p>
@@ -6253,7 +6363,7 @@
           <w:sz w:val="22"/>
           <w:szCs w:val="22"/>
         </w:rPr>
-        <w:t>The system creates a fault record and raises an alert on the dashboard, showing the equipment, the parameter, and the severity.</w:t>
+        <w:t>The system creates a fault record and raises an alert on the dashboard, showing the equipment, the parameter, the fault type, the severity and the time (FR-7a).</w:t>
       </w:r>
     </w:p>
     <w:p>
@@ -6376,7 +6486,7 @@
           <w:sz w:val="22"/>
           <w:szCs w:val="22"/>
         </w:rPr>
-        <w:t xml:space="preserve">7a. No user acknowledges the alert: the fault remains visible on the dashboard as open until it is acknowledged or the condition returns to normal.</w:t>
+        <w:t>7a. No user acknowledges the alert: the fault stays open and visible on the dashboard until it is acknowledged and an Engineer marks it resolved (FR-8b, FR-17).</w:t>
       </w:r>
     </w:p>
     <w:p>

</xml_diff>